<commit_message>
gendoc: update to v1.6.0 — SR viewer, overlay planes, Overlays toggle
Adds missing v1.6.0 content to gendoc/main.go (the source of truth for
both output files) so build-release.sh always generates current docs:
- Cover subtitle and status-bar table: v1.5.0 -> v1.6.0
- Overview bullet: add overlay plane compositing and SR viewer
- Section 8.3.1: add Overlays checkbox to bottom-bar description
- Section 8.3.6 (new): DICOM Overlay Planes
- Section 8.3.7 (new): Structured Report Viewer
- Appendix A: mention Overlays toggle alongside Annotations

Regenerates dicomqr-user-manual.md and dicomqr-user-manual.docx.

Co-Authored-By: Claude Sonnet 4.6 <noreply@anthropic.com>
</commit_message>
<xml_diff>
--- a/dicomqr-user-manual.docx
+++ b/dicomqr-user-manual.docx
@@ -71,7 +71,7 @@
           <w:sz w:val="32"/>
           <w:szCs w:val="32"/>
         </w:rPr>
-        <w:t xml:space="preserve">User Manual  v1.5.0</w:t>
+        <w:t xml:space="preserve">User Manual  v1.6.0</w:t>
       </w:r>
     </w:p>
     <w:p>
@@ -194,7 +194,15 @@
         <w:pStyle w:val="ListBullet"/>
       </w:pPr>
       <w:r>
-        <w:t xml:space="preserve">Preview DICOM images in the built-in viewer with interactive window/level, zoom and pan, modality-specific W/L presets, colour maps for PET/SPECT, DICOM annotation overlays, and study overview grids; decodes JPEG Baseline, JPEG 2000, and uncompressed pixel data</w:t>
+        <w:t xml:space="preserve">Preview DICOM images in the built-in viewer with interactive window/level, zoom and pan, modality-specific W/L presets, colour maps for PET/SPECT, DICOM annotation overlays, DICOM overlay plane compositing, and study overview grids; decodes JPEG Baseline, JPEG 2000, and uncompressed pixel data</w:t>
+      </w:r>
+    </w:p>
+    <w:p>
+      <w:pPr>
+        <w:pStyle w:val="ListBullet"/>
+      </w:pPr>
+      <w:r>
+        <w:t xml:space="preserve">View Structured Reports (SR), Key Object Selections (KO), and other non-image DICOM objects in a dedicated scrollable document viewer that renders the SR Content Sequence as formatted text</w:t>
       </w:r>
     </w:p>
     <w:p>
@@ -2315,7 +2323,7 @@
         <w:t xml:space="preserve">45 / 120</w:t>
       </w:r>
       <w:r>
-        <w:t xml:space="preserve">), a navigation slider, a Window preset dropdown (see Section 8.3.2), a Colour map dropdown (see Section 8.3.3), an Annotations checkbox (see Section 8.3.5), a Reset button, and an info label showing pixel dimensions and the current W/L values.</w:t>
+        <w:t xml:space="preserve">), a navigation slider, a Window preset dropdown (see Section 8.3.2), a Colour map dropdown (see Section 8.3.3), an Annotations checkbox (see Section 8.3.5), an Overlays checkbox (see Section 8.3.6, shown only when overlay planes are present), a Reset button, and an info label showing pixel dimensions and the current W/L values.</w:t>
       </w:r>
     </w:p>
     <w:p>
@@ -3280,6 +3288,81 @@
     </w:p>
     <w:p>
       <w:pPr>
+        <w:pStyle w:val="Heading3"/>
+      </w:pPr>
+      <w:r>
+        <w:t>8.3.6  DICOM Overlay Planes</w:t>
+      </w:r>
+    </w:p>
+    <w:p>
+      <w:r>
+        <w:t xml:space="preserve">Some images — particularly CT and MR "protocol" series — contain one or more 1-bit bitmap overlay planes embedded in the DICOM file alongside the pixel data (groups 6000–60FE). These planes carry annotations such as scan limits, region-of-interest boundaries, or facility branding burned in at the modality.</w:t>
+      </w:r>
+    </w:p>
+    <w:p>
+      <w:r>
+        <w:t xml:space="preserve">When overlay planes are present, dicomqr composites them onto the image in opaque yellow after applying window/level, so they remain visible at any W/L setting. Multiple overlay planes are all composited in the same pass.</w:t>
+      </w:r>
+    </w:p>
+    <w:p>
+      <w:r>
+        <w:t xml:space="preserve">The Overlays checkbox in the viewer bottom bar toggles this compositing on and off. The checkbox is hidden for series that contain no overlay planes and appears automatically on the first frame in which overlays are detected. The toggle state persists between sessions.</w:t>
+      </w:r>
+    </w:p>
+    <w:p>
+      <w:r>
+        <w:t xml:space="preserve">Note: the obsolete encoding in which overlay bits are packed inside unused bits of the pixel data words (OverlayBitPosition &gt; 0, retired in the DICOM 2004 edition) is not supported and is silently skipped.</w:t>
+      </w:r>
+    </w:p>
+    <w:p>
+      <w:pPr>
+        <w:pStyle w:val="Heading3"/>
+      </w:pPr>
+      <w:r>
+        <w:t>8.3.7  Structured Report Viewer</w:t>
+      </w:r>
+    </w:p>
+    <w:p>
+      <w:r>
+        <w:t xml:space="preserve">Series whose modality is SR (Structured Report), KO (Key Object Selection), AU (Audio), or PR (Presentation State) contain no pixel data and are automatically opened in the document viewer instead of the image viewer.</w:t>
+      </w:r>
+    </w:p>
+    <w:p>
+      <w:r>
+        <w:t xml:space="preserve">The document viewer window has three areas:</w:t>
+      </w:r>
+    </w:p>
+    <w:p>
+      <w:pPr>
+        <w:pStyle w:val="ListBullet"/>
+      </w:pPr>
+      <w:r>
+        <w:t xml:space="preserve">Header — patient name, MRN, date of birth, sex and age; study date, accession number and description; modality, series information, content date/time, and the DICOM completion and verification status flags (e.g. COMPLETE · VERIFIED)</w:t>
+      </w:r>
+    </w:p>
+    <w:p>
+      <w:pPr>
+        <w:pStyle w:val="ListBullet"/>
+      </w:pPr>
+      <w:r>
+        <w:t xml:space="preserve">Body — the SR Content Sequence rendered as scrollable formatted text. CONTAINER items appear as section headings; leaf items appear as labelled value pairs. Supported value types: TEXT, NUM (with measurement units), CODE, DATE, TIME, PNAME, UIDREF, IMAGE (shown as a UID reference), and nested CONTAINERs</w:t>
+      </w:r>
+    </w:p>
+    <w:p>
+      <w:pPr>
+        <w:pStyle w:val="ListBullet"/>
+      </w:pPr>
+      <w:r>
+        <w:t xml:space="preserve">Footer — Prev / Next buttons to step through multi-file series; a counter showing the current document position; a Copy text button that places a plain-text version of the document body on the clipboard</w:t>
+      </w:r>
+    </w:p>
+    <w:p>
+      <w:r>
+        <w:t xml:space="preserve">The viewer opens at document 1 of the series and loads subsequent documents in the background as you navigate.</w:t>
+      </w:r>
+    </w:p>
+    <w:p>
+      <w:pPr>
         <w:pStyle w:val="Heading2"/>
       </w:pPr>
       <w:r>
@@ -5380,7 +5463,7 @@
                 <w:szCs w:val="18"/>
                 <w:shd w:val="clear" w:color="auto" w:fill="EBEBEB"/>
               </w:rPr>
-              <w:t xml:space="preserve">v1.5.0</w:t>
+              <w:t xml:space="preserve">v1.6.0</w:t>
             </w:r>
           </w:p>
         </w:tc>
@@ -7045,7 +7128,7 @@
     <w:p/>
     <w:p>
       <w:r>
-        <w:t xml:space="preserve">The Annotations overlay toggle is stored in the application's Fyne preferences (not in settings.json) and persists automatically between sessions.</w:t>
+        <w:t xml:space="preserve">The Annotations and Overlays toggles are stored in the application's Fyne preferences (not in settings.json) and persist automatically between sessions.</w:t>
       </w:r>
     </w:p>
     <w:p>

</xml_diff>

<commit_message>
Release v1.9.0 — skip-not-abort transfer syntax retrieves; preview progress dialogs and reflowing overview grid; tab reorder; exit-path and panic hardening
Co-Authored-By: Claude Fable 5 <noreply@anthropic.com>
</commit_message>
<xml_diff>
--- a/dicomqr-user-manual.docx
+++ b/dicomqr-user-manual.docx
@@ -71,7 +71,7 @@
           <w:sz w:val="32"/>
           <w:szCs w:val="32"/>
         </w:rPr>
-        <w:t xml:space="preserve">User Manual  v1.8.0</w:t>
+        <w:t xml:space="preserve">User Manual  v1.9.0</w:t>
       </w:r>
     </w:p>
     <w:p>
@@ -85,7 +85,7 @@
           <w:sz w:val="24"/>
           <w:szCs w:val="24"/>
         </w:rPr>
-        <w:t xml:space="preserve">July 23, 2026</w:t>
+        <w:t xml:space="preserve">July 24, 2026</w:t>
       </w:r>
     </w:p>
     <w:p>
@@ -226,7 +226,7 @@
         <w:pStyle w:val="ListBullet"/>
       </w:pPr>
       <w:r>
-        <w:t xml:space="preserve">Optionally require a specific uncompressed transfer syntax per server profile — Explicit or Implicit VR Little Endian — guaranteed on disk: the server sends it directly, or files arriving in a decodable syntax (JPEG Baseline/Extended, JPEG 2000, the other uncompressed VR) are converted on receipt; the retrieve fails with a clear error only when neither is possible</w:t>
+        <w:t xml:space="preserve">Optionally require a specific uncompressed transfer syntax per server profile — Explicit or Implicit VR Little Endian — guaranteed on disk: the server sends it directly, or files arriving in a decodable syntax (JPEG Baseline/Extended, JPEG 2000, the other uncompressed VR) are converted on receipt; objects that can be neither delivered nor converted are skipped and reported while the rest of the study is retrieved</w:t>
       </w:r>
     </w:p>
     <w:p>
@@ -519,7 +519,7 @@
         <w:t xml:space="preserve">dicomqr.exe</w:t>
       </w:r>
       <w:r>
-        <w:t xml:space="preserve"> to launch the application. The main window opens with an empty results tree and the status bar showing the application version. The window is restored to the size it had when last closed.</w:t>
+        <w:t xml:space="preserve"> to launch the application. The main window opens on the Local Browse tab, showing the indexed contents of the download folder; the status bar shows the application version. The window is restored to the size it had when last closed.</w:t>
       </w:r>
     </w:p>
     <w:p>
@@ -542,7 +542,7 @@
     </w:p>
     <w:p>
       <w:r>
-        <w:t xml:space="preserve">Tab area — four tabs:</w:t>
+        <w:t xml:space="preserve">Tab area — four tabs, in this order:</w:t>
       </w:r>
     </w:p>
     <w:tbl>
@@ -610,6 +610,29 @@
           </w:tcPr>
           <w:p>
             <w:r>
+              <w:t xml:space="preserve">Local Browse</w:t>
+            </w:r>
+          </w:p>
+        </w:tc>
+        <w:tc>
+          <w:tcPr>
+            <w:tcW w:w="6300" w:type="dxa"/>
+          </w:tcPr>
+          <w:p>
+            <w:r>
+              <w:t xml:space="preserve">Browse, preview, push, and delete files in the download folder.</w:t>
+            </w:r>
+          </w:p>
+        </w:tc>
+      </w:tr>
+      <w:tr>
+        <w:tc>
+          <w:tcPr>
+            <w:tcW w:w="2700" w:type="dxa"/>
+            <w:shd w:val="clear" w:color="auto" w:fill="F5F5F5"/>
+          </w:tcPr>
+          <w:p>
+            <w:r>
               <w:t xml:space="preserve">PACS Query</w:t>
             </w:r>
           </w:p>
@@ -617,6 +640,7 @@
         <w:tc>
           <w:tcPr>
             <w:tcW w:w="6300" w:type="dxa"/>
+            <w:shd w:val="clear" w:color="auto" w:fill="F5F5F5"/>
           </w:tcPr>
           <w:p>
             <w:r>
@@ -629,6 +653,28 @@
         <w:tc>
           <w:tcPr>
             <w:tcW w:w="2700" w:type="dxa"/>
+          </w:tcPr>
+          <w:p>
+            <w:r>
+              <w:t xml:space="preserve">Import</w:t>
+            </w:r>
+          </w:p>
+        </w:tc>
+        <w:tc>
+          <w:tcPr>
+            <w:tcW w:w="6300" w:type="dxa"/>
+          </w:tcPr>
+          <w:p>
+            <w:r>
+              <w:t xml:space="preserve">Copy DICOM files from an external folder into the download folder.</w:t>
+            </w:r>
+          </w:p>
+        </w:tc>
+      </w:tr>
+      <w:tr>
+        <w:tc>
+          <w:tcPr>
+            <w:tcW w:w="2700" w:type="dxa"/>
             <w:shd w:val="clear" w:color="auto" w:fill="F5F5F5"/>
           </w:tcPr>
           <w:p>
@@ -645,58 +691,17 @@
           <w:p>
             <w:r>
               <w:t xml:space="preserve">Query a Modality Worklist server for scheduled procedures.</w:t>
-            </w:r>
-          </w:p>
-        </w:tc>
-      </w:tr>
-      <w:tr>
-        <w:tc>
-          <w:tcPr>
-            <w:tcW w:w="2700" w:type="dxa"/>
-          </w:tcPr>
-          <w:p>
-            <w:r>
-              <w:t xml:space="preserve">Local Browse</w:t>
-            </w:r>
-          </w:p>
-        </w:tc>
-        <w:tc>
-          <w:tcPr>
-            <w:tcW w:w="6300" w:type="dxa"/>
-          </w:tcPr>
-          <w:p>
-            <w:r>
-              <w:t xml:space="preserve">Browse, preview, push, and delete files in the download folder.</w:t>
-            </w:r>
-          </w:p>
-        </w:tc>
-      </w:tr>
-      <w:tr>
-        <w:tc>
-          <w:tcPr>
-            <w:tcW w:w="2700" w:type="dxa"/>
-            <w:shd w:val="clear" w:color="auto" w:fill="F5F5F5"/>
-          </w:tcPr>
-          <w:p>
-            <w:r>
-              <w:t xml:space="preserve">Import</w:t>
-            </w:r>
-          </w:p>
-        </w:tc>
-        <w:tc>
-          <w:tcPr>
-            <w:tcW w:w="6300" w:type="dxa"/>
-            <w:shd w:val="clear" w:color="auto" w:fill="F5F5F5"/>
-          </w:tcPr>
-          <w:p>
-            <w:r>
-              <w:t xml:space="preserve">Copy DICOM files from an external folder into the download folder.</w:t>
             </w:r>
           </w:p>
         </w:tc>
       </w:tr>
     </w:tbl>
     <w:p/>
+    <w:p>
+      <w:r>
+        <w:t xml:space="preserve">The Local Browse tab is active when the application starts.</w:t>
+      </w:r>
+    </w:p>
     <w:p>
       <w:r>
         <w:t xml:space="preserve">Status bar — the bottom strip. A coloured LED indicator precedes the status text. A clock shows the current date and time. A progress bar appears during queries and retrieves.</w:t>
@@ -1020,7 +1025,7 @@
               <w:t xml:space="preserve">1.2.840.10008.1.2</w:t>
             </w:r>
             <w:r>
-              <w:t xml:space="preserve">). Negotiation offers the required syntax first, so a transcoding-capable PACS sends it directly; a PACS that only serves objects in their stored form may instead send any syntax the application can decode (the other uncompressed VR, JPEG Baseline/Extended, JPEG 2000), and each such file is converted to the required syntax on receipt, before it reaches the download folder. The status bar reports how many files needed local conversion. If an object can be delivered neither in the required syntax nor in a locally convertible one (e.g. the archive stores JPEG-LS or RLE), the retrieve is aborted with an error dialog naming the required syntax rather than leaving a partial or mixed study; switch the profile back to 'As stored' to retrieve such data in its stored form.</w:t>
+              <w:t xml:space="preserve">). Negotiation offers the required syntax first, so a transcoding-capable PACS sends it directly; a PACS that only serves objects in their stored form may instead send any syntax the application can decode (the other uncompressed VR, JPEG Baseline/Extended, JPEG 2000), and each such file is converted to the required syntax on receipt, before it reaches the download folder. The status bar reports how many files needed local conversion. Objects that cannot be obtained in the required syntax do not stop the retrieve: an object the server cannot deliver in any negotiable syntax (e.g. the archive stores JPEG-LS or RLE and does not transcode), or one that arrives but fails local conversion (e.g. a screenshot with undecodable pixel data), is skipped — reported in the Activity Log and counted in the completion status — while every deliverable object is retrieved and stored in the required syntax. Only when the server can deliver nothing at all in a negotiable syntax does an error dialog appear, naming the required syntax; switch the profile back to 'As stored' to retrieve such data in its stored form.</w:t>
             </w:r>
           </w:p>
         </w:tc>
@@ -1972,23 +1977,112 @@
     <w:p/>
     <w:p>
       <w:pPr>
+        <w:pStyle w:val="Heading1"/>
+      </w:pPr>
+      <w:r>
+        <w:t>7  Retrieving Files</w:t>
+      </w:r>
+    </w:p>
+    <w:p>
+      <w:pPr>
         <w:pStyle w:val="Heading2"/>
       </w:pPr>
       <w:r>
-        <w:t>6.5  Tooltips</w:t>
-      </w:r>
-    </w:p>
-    <w:p>
-      <w:r>
-        <w:t xml:space="preserve">Hovering the mouse cursor over a study or series row for approximately 0.6 seconds displays a tooltip showing the Study Instance UID and Accession Number (for study rows) or the Series Instance UID and Modality (for series rows). Moving the cursor off the row dismisses the tooltip immediately.</w:t>
-      </w:r>
-    </w:p>
-    <w:p>
-      <w:pPr>
-        <w:pStyle w:val="Heading1"/>
-      </w:pPr>
-      <w:r>
-        <w:t>7  Retrieving Files</w:t>
+        <w:t>7.1  Prerequisites</w:t>
+      </w:r>
+    </w:p>
+    <w:p>
+      <w:r>
+        <w:t xml:space="preserve">The conditions required depend on the Retrieve method configured for the server profile (see Section 4.1).</w:t>
+      </w:r>
+    </w:p>
+    <w:p>
+      <w:r>
+        <w:t xml:space="preserve">For C-MOVE (default):</w:t>
+      </w:r>
+    </w:p>
+    <w:p>
+      <w:pPr>
+        <w:pStyle w:val="ListBullet"/>
+      </w:pPr>
+      <w:r>
+        <w:t xml:space="preserve">The application must be connected to a PACS server (status bar shows "Connected").</w:t>
+      </w:r>
+    </w:p>
+    <w:p>
+      <w:pPr>
+        <w:pStyle w:val="ListBullet"/>
+      </w:pPr>
+      <w:r>
+        <w:t xml:space="preserve">The embedded C-STORE listener must be running. It starts automatically when a connection is established.</w:t>
+      </w:r>
+    </w:p>
+    <w:p>
+      <w:pPr>
+        <w:pStyle w:val="ListBullet"/>
+      </w:pPr>
+      <w:r>
+        <w:t xml:space="preserve">The PACS must have the local AE Title, IP address, and port registered as a known destination. See Section 2.2.</w:t>
+      </w:r>
+    </w:p>
+    <w:p>
+      <w:pPr>
+        <w:pStyle w:val="ListBullet"/>
+      </w:pPr>
+      <w:r>
+        <w:t xml:space="preserve">The download folder must be configured. Click Browse… next to the Download to field in the retrieve panel.</w:t>
+      </w:r>
+    </w:p>
+    <w:p>
+      <w:pPr>
+        <w:pStyle w:val="ListBullet"/>
+      </w:pPr>
+      <w:r>
+        <w:t xml:space="preserve">At least one item must be selected in the results tree.</w:t>
+      </w:r>
+    </w:p>
+    <w:p>
+      <w:r>
+        <w:t xml:space="preserve">For C-GET:</w:t>
+      </w:r>
+    </w:p>
+    <w:p>
+      <w:pPr>
+        <w:pStyle w:val="ListBullet"/>
+      </w:pPr>
+      <w:r>
+        <w:t xml:space="preserve">The application must be connected to a PACS server.</w:t>
+      </w:r>
+    </w:p>
+    <w:p>
+      <w:pPr>
+        <w:pStyle w:val="ListBullet"/>
+      </w:pPr>
+      <w:r>
+        <w:t xml:space="preserve">The download folder must be configured.</w:t>
+      </w:r>
+    </w:p>
+    <w:p>
+      <w:pPr>
+        <w:pStyle w:val="ListBullet"/>
+      </w:pPr>
+      <w:r>
+        <w:t xml:space="preserve">At least one item must be selected.</w:t>
+      </w:r>
+    </w:p>
+    <w:p>
+      <w:r>
+        <w:t xml:space="preserve">No inbound SCP port or PACS-side destination AE registration is required for C-GET. The PACS returns files over the existing outbound connection.</w:t>
+      </w:r>
+    </w:p>
+    <w:p>
+      <w:r>
+        <w:t xml:space="preserve">For Auto: dicomqr attempts C-GET first. If the PACS rejects C-GET, it retries each item using C-MOVE. The C-MOVE prerequisites above apply as a fallback.</w:t>
+      </w:r>
+    </w:p>
+    <w:p>
+      <w:r>
+        <w:t xml:space="preserve">Regardless of method, dicomqr verifies that the download folder exists and is writable before a retrieve begins. If it is not, an error dialog is shown and no retrieve is started.</w:t>
       </w:r>
     </w:p>
     <w:p>
@@ -1996,17 +2090,12 @@
         <w:pStyle w:val="Heading2"/>
       </w:pPr>
       <w:r>
-        <w:t>7.1  Prerequisites</w:t>
-      </w:r>
-    </w:p>
-    <w:p>
-      <w:r>
-        <w:t xml:space="preserve">The conditions required depend on the Retrieve method configured for the server profile (see Section 4.1).</w:t>
-      </w:r>
-    </w:p>
-    <w:p>
-      <w:r>
-        <w:t xml:space="preserve">For C-MOVE (default):</w:t>
+        <w:t>7.2  Starting a Retrieve</w:t>
+      </w:r>
+    </w:p>
+    <w:p>
+      <w:r>
+        <w:t xml:space="preserve">Select one or more rows in the results tree, then click Retrieve Selected (or select Query &gt; Retrieve Selected). dicomqr issues a retrieve request for each selected item using the method configured in the server profile:</w:t>
       </w:r>
     </w:p>
     <w:p>
@@ -2014,7 +2103,7 @@
         <w:pStyle w:val="ListBullet"/>
       </w:pPr>
       <w:r>
-        <w:t xml:space="preserve">The application must be connected to a PACS server (status bar shows "Connected").</w:t>
+        <w:t xml:space="preserve">C-MOVE — dicomqr sends a C-MOVE request; the PACS pushes files to the local C-STORE SCP listener, which writes them to the download folder.</w:t>
       </w:r>
     </w:p>
     <w:p>
@@ -2022,7 +2111,7 @@
         <w:pStyle w:val="ListBullet"/>
       </w:pPr>
       <w:r>
-        <w:t xml:space="preserve">The embedded C-STORE listener must be running. It starts automatically when a connection is established.</w:t>
+        <w:t xml:space="preserve">C-GET — dicomqr sends a C-GET request; the PACS streams files back over the same association directly.</w:t>
       </w:r>
     </w:p>
     <w:p>
@@ -2030,67 +2119,12 @@
         <w:pStyle w:val="ListBullet"/>
       </w:pPr>
       <w:r>
-        <w:t xml:space="preserve">The PACS must have the local AE Title, IP address, and port registered as a known destination. See Section 2.2.</w:t>
-      </w:r>
-    </w:p>
-    <w:p>
-      <w:pPr>
-        <w:pStyle w:val="ListBullet"/>
-      </w:pPr>
-      <w:r>
-        <w:t xml:space="preserve">The download folder must be configured. Click Browse… next to the Download to field in the retrieve panel.</w:t>
-      </w:r>
-    </w:p>
-    <w:p>
-      <w:pPr>
-        <w:pStyle w:val="ListBullet"/>
-      </w:pPr>
-      <w:r>
-        <w:t xml:space="preserve">At least one item must be selected in the results tree.</w:t>
-      </w:r>
-    </w:p>
-    <w:p>
-      <w:r>
-        <w:t xml:space="preserve">For C-GET:</w:t>
-      </w:r>
-    </w:p>
-    <w:p>
-      <w:pPr>
-        <w:pStyle w:val="ListBullet"/>
-      </w:pPr>
-      <w:r>
-        <w:t xml:space="preserve">The application must be connected to a PACS server.</w:t>
-      </w:r>
-    </w:p>
-    <w:p>
-      <w:pPr>
-        <w:pStyle w:val="ListBullet"/>
-      </w:pPr>
-      <w:r>
-        <w:t xml:space="preserve">The download folder must be configured.</w:t>
-      </w:r>
-    </w:p>
-    <w:p>
-      <w:pPr>
-        <w:pStyle w:val="ListBullet"/>
-      </w:pPr>
-      <w:r>
-        <w:t xml:space="preserve">At least one item must be selected.</w:t>
-      </w:r>
-    </w:p>
-    <w:p>
-      <w:r>
-        <w:t xml:space="preserve">No inbound SCP port or PACS-side destination AE registration is required for C-GET. The PACS returns files over the existing outbound connection.</w:t>
-      </w:r>
-    </w:p>
-    <w:p>
-      <w:r>
-        <w:t xml:space="preserve">For Auto: dicomqr attempts C-GET first. If the PACS rejects C-GET, it retries each item using C-MOVE. The C-MOVE prerequisites above apply as a fallback.</w:t>
-      </w:r>
-    </w:p>
-    <w:p>
-      <w:r>
-        <w:t xml:space="preserve">Regardless of method, dicomqr verifies that the download folder exists and is writable before a retrieve begins. If it is not, an error dialog is shown and no retrieve is started.</w:t>
+        <w:t xml:space="preserve">Auto — dicomqr attempts C-GET; if the PACS rejects it, the request is retried using C-MOVE.</w:t>
+      </w:r>
+    </w:p>
+    <w:p>
+      <w:r>
+        <w:t xml:space="preserve">Selecting a study retrieves all of its series in one request; selecting individual series retrieves each independently. A progress bar appears and advances as each study or series is transferred.</w:t>
       </w:r>
     </w:p>
     <w:p>
@@ -2098,54 +2132,12 @@
         <w:pStyle w:val="Heading2"/>
       </w:pPr>
       <w:r>
-        <w:t>7.2  Starting a Retrieve</w:t>
-      </w:r>
-    </w:p>
-    <w:p>
-      <w:r>
-        <w:t xml:space="preserve">Select one or more rows in the results tree, then click Retrieve Selected (or select Query &gt; Retrieve Selected). dicomqr issues a retrieve request for each selected item using the method configured in the server profile:</w:t>
-      </w:r>
-    </w:p>
-    <w:p>
-      <w:pPr>
-        <w:pStyle w:val="ListBullet"/>
-      </w:pPr>
-      <w:r>
-        <w:t xml:space="preserve">C-MOVE — dicomqr sends a C-MOVE request; the PACS pushes files to the local C-STORE SCP listener, which writes them to the download folder.</w:t>
-      </w:r>
-    </w:p>
-    <w:p>
-      <w:pPr>
-        <w:pStyle w:val="ListBullet"/>
-      </w:pPr>
-      <w:r>
-        <w:t xml:space="preserve">C-GET — dicomqr sends a C-GET request; the PACS streams files back over the same association directly.</w:t>
-      </w:r>
-    </w:p>
-    <w:p>
-      <w:pPr>
-        <w:pStyle w:val="ListBullet"/>
-      </w:pPr>
-      <w:r>
-        <w:t xml:space="preserve">Auto — dicomqr attempts C-GET; if the PACS rejects it, the request is retried using C-MOVE.</w:t>
-      </w:r>
-    </w:p>
-    <w:p>
-      <w:r>
-        <w:t xml:space="preserve">Selecting a study retrieves all of its series in one request; selecting individual series retrieves each independently. A progress bar appears and advances as each study or series is transferred.</w:t>
-      </w:r>
-    </w:p>
-    <w:p>
-      <w:pPr>
-        <w:pStyle w:val="Heading2"/>
-      </w:pPr>
-      <w:r>
         <w:t>7.3  Progress</w:t>
       </w:r>
     </w:p>
     <w:p>
       <w:r>
-        <w:t xml:space="preserve">The progress bar tracks completion across all selected studies and series, advancing as each study or series finishes. For C-MOVE the bar also advances within a study as individual files arrive; for C-GET it advances once per completed target. As each file arrives, the status bar briefly shows the path of the received file.</w:t>
+        <w:t xml:space="preserve">The progress bar tracks completion across all selected studies and series, advancing as each study or series finishes. For both C-MOVE and C-GET the bar also advances within a study as the server reports sub-operation progress. As each file arrives, the status bar briefly shows the path of the received file.</w:t>
       </w:r>
     </w:p>
     <w:p>
@@ -2237,7 +2229,7 @@
     </w:p>
     <w:p>
       <w:r>
-        <w:t xml:space="preserve">When the profile requires a specific transfer syntax, error handling is stricter: the first failed sub-operation or target error aborts the whole retrieve immediately and a dialog reports the required syntax, the failure details, and how many files (all in the required syntax) were received before the abort. There is no partial-retry offer — every object is either delivered in (or converted to) the required syntax, or the retrieve fails. When files arrived in a different syntax and were converted locally, the completion status appends '(N converted locally to …)'.</w:t>
+        <w:t xml:space="preserve">When the profile requires a specific transfer syntax, the completion status also accounts for objects that could not be obtained in it — the retrieve continues past them rather than aborting. Files that arrived in a different syntax and were converted locally are counted as '(N converted locally to …)'. An object that arrives but cannot be converted (for example a screenshot or vendor graphic whose pixel data has no built-in decoder) is skipped — it never reaches the download folder — and the status appends '— N unconvertible object(s) skipped, see Activity Log'. An object the server could not deliver in any negotiable syntax appends '— N not delivered by the server, see Activity Log'. Each skipped or undelivered object is logged with its SOP Instance UID and series so it can be identified afterwards, and every file that does reach the download folder is guaranteed to be in the required syntax. Only when the server delivers nothing at all in a negotiable syntax (zero files received) does an error dialog appear, naming the required syntax and recommending the 'As stored' setting for that server.</w:t>
       </w:r>
     </w:p>
     <w:p>
@@ -3183,7 +3175,12 @@
     </w:p>
     <w:p>
       <w:r>
-        <w:t xml:space="preserve">The overview window shows one thumbnail per series — the middle slice of each series rendered in parallel. Thumbnails are arranged in a three-column grid. Double-click any thumbnail to open that series in the full series viewer.</w:t>
+        <w:t xml:space="preserve">The overview window shows one thumbnail per series — the middle slice of each series rendered in parallel. Thumbnails flow from the top-left, wrapping into as many columns as fit the window, and reflow when the window is resized. Double-click any thumbnail to open that series in the full series viewer.</w:t>
+      </w:r>
+    </w:p>
+    <w:p>
+      <w:r>
+        <w:t xml:space="preserve">While the overview is generated, a progress dialog counts the series as they load — studies with thousands of images can take several seconds. Series previews and the folder Preview button show the same dialog while large image sets are scanned and sorted; the application remains responsive throughout.</w:t>
       </w:r>
     </w:p>
     <w:p>
@@ -5538,7 +5535,7 @@
                 <w:szCs w:val="18"/>
                 <w:shd w:val="clear" w:color="auto" w:fill="EBEBEB"/>
               </w:rPr>
-              <w:t xml:space="preserve">v1.8.0</w:t>
+              <w:t xml:space="preserve">v1.9.0</w:t>
             </w:r>
           </w:p>
         </w:tc>
@@ -5928,6 +5925,93 @@
           </w:tcPr>
           <w:p>
             <w:r>
+              <w:t xml:space="preserve">Retrieve complete, objects skipped (required syntax)</w:t>
+            </w:r>
+          </w:p>
+        </w:tc>
+        <w:tc>
+          <w:tcPr>
+            <w:tcW w:w="6300" w:type="dxa"/>
+          </w:tcPr>
+          <w:p>
+            <w:r>
+              <w:rPr>
+                <w:rFonts w:ascii="Courier New" w:hAnsi="Courier New"/>
+                <w:sz w:val="18"/>
+                <w:szCs w:val="18"/>
+                <w:shd w:val="clear" w:color="auto" w:fill="EBEBEB"/>
+              </w:rPr>
+              <w:t xml:space="preserve">Retrieved &lt;N&gt; files successfully — &lt;M&gt; unconvertible object(s) skipped, see Activity Log</w:t>
+            </w:r>
+          </w:p>
+        </w:tc>
+      </w:tr>
+      <w:tr>
+        <w:tc>
+          <w:tcPr>
+            <w:tcW w:w="2700" w:type="dxa"/>
+            <w:shd w:val="clear" w:color="auto" w:fill="F5F5F5"/>
+          </w:tcPr>
+          <w:p>
+            <w:r>
+              <w:t xml:space="preserve">Retrieve complete, objects undeliverable (required syntax)</w:t>
+            </w:r>
+          </w:p>
+        </w:tc>
+        <w:tc>
+          <w:tcPr>
+            <w:tcW w:w="6300" w:type="dxa"/>
+            <w:shd w:val="clear" w:color="auto" w:fill="F5F5F5"/>
+          </w:tcPr>
+          <w:p>
+            <w:r>
+              <w:rPr>
+                <w:rFonts w:ascii="Courier New" w:hAnsi="Courier New"/>
+                <w:sz w:val="18"/>
+                <w:szCs w:val="18"/>
+                <w:shd w:val="clear" w:color="auto" w:fill="EBEBEB"/>
+              </w:rPr>
+              <w:t xml:space="preserve">Retrieved &lt;N&gt; files successfully — &lt;M&gt; not delivered by the server, see Activity Log</w:t>
+            </w:r>
+          </w:p>
+        </w:tc>
+      </w:tr>
+      <w:tr>
+        <w:tc>
+          <w:tcPr>
+            <w:tcW w:w="2700" w:type="dxa"/>
+          </w:tcPr>
+          <w:p>
+            <w:r>
+              <w:t xml:space="preserve">Retrieve failed — nothing deliverable in the required syntax</w:t>
+            </w:r>
+          </w:p>
+        </w:tc>
+        <w:tc>
+          <w:tcPr>
+            <w:tcW w:w="6300" w:type="dxa"/>
+          </w:tcPr>
+          <w:p>
+            <w:r>
+              <w:rPr>
+                <w:rFonts w:ascii="Courier New" w:hAnsi="Courier New"/>
+                <w:sz w:val="18"/>
+                <w:szCs w:val="18"/>
+                <w:shd w:val="clear" w:color="auto" w:fill="EBEBEB"/>
+              </w:rPr>
+              <w:t xml:space="preserve">Retrieve failed — the server could not deliver any of &lt;M&gt; object(s) in &lt;syntax&gt;</w:t>
+            </w:r>
+          </w:p>
+        </w:tc>
+      </w:tr>
+      <w:tr>
+        <w:tc>
+          <w:tcPr>
+            <w:tcW w:w="2700" w:type="dxa"/>
+            <w:shd w:val="clear" w:color="auto" w:fill="F5F5F5"/>
+          </w:tcPr>
+          <w:p>
+            <w:r>
               <w:t xml:space="preserve">Retrieve complete with warnings</w:t>
             </w:r>
           </w:p>
@@ -5935,6 +6019,7 @@
         <w:tc>
           <w:tcPr>
             <w:tcW w:w="6300" w:type="dxa"/>
+            <w:shd w:val="clear" w:color="auto" w:fill="F5F5F5"/>
           </w:tcPr>
           <w:p>
             <w:r>
@@ -5953,7 +6038,6 @@
         <w:tc>
           <w:tcPr>
             <w:tcW w:w="2700" w:type="dxa"/>
-            <w:shd w:val="clear" w:color="auto" w:fill="F5F5F5"/>
           </w:tcPr>
           <w:p>
             <w:r>
@@ -5964,7 +6048,6 @@
         <w:tc>
           <w:tcPr>
             <w:tcW w:w="6300" w:type="dxa"/>
-            <w:shd w:val="clear" w:color="auto" w:fill="F5F5F5"/>
           </w:tcPr>
           <w:p>
             <w:r>
@@ -5983,6 +6066,7 @@
         <w:tc>
           <w:tcPr>
             <w:tcW w:w="2700" w:type="dxa"/>
+            <w:shd w:val="clear" w:color="auto" w:fill="F5F5F5"/>
           </w:tcPr>
           <w:p>
             <w:r>
@@ -5993,6 +6077,7 @@
         <w:tc>
           <w:tcPr>
             <w:tcW w:w="6300" w:type="dxa"/>
+            <w:shd w:val="clear" w:color="auto" w:fill="F5F5F5"/>
           </w:tcPr>
           <w:p>
             <w:r>
@@ -6011,7 +6096,6 @@
         <w:tc>
           <w:tcPr>
             <w:tcW w:w="2700" w:type="dxa"/>
-            <w:shd w:val="clear" w:color="auto" w:fill="F5F5F5"/>
           </w:tcPr>
           <w:p>
             <w:r>
@@ -6022,7 +6106,6 @@
         <w:tc>
           <w:tcPr>
             <w:tcW w:w="6300" w:type="dxa"/>
-            <w:shd w:val="clear" w:color="auto" w:fill="F5F5F5"/>
           </w:tcPr>
           <w:p>
             <w:r>
@@ -7271,7 +7354,7 @@
               <w:t xml:space="preserve">"implicit-le"</w:t>
             </w:r>
             <w:r>
-              <w:t xml:space="preserve">. The non-empty values guarantee every retrieved file is stored in that syntax: negotiation offers it first plus the locally decodable syntaxes, files arriving in any other accepted syntax are converted on receipt, and the retrieve aborts with an error when an object can be neither delivered nor converted. Re-retrieves replace existing on-disk copies whose transfer syntax differs from the required one.</w:t>
+              <w:t xml:space="preserve">. The non-empty values guarantee every retrieved file is stored in that syntax: negotiation offers it first plus the locally decodable syntaxes, files arriving in any other accepted syntax are converted on receipt, and objects that can be neither delivered nor converted are skipped and reported while the retrieve continues. Re-retrieves replace existing on-disk copies whose transfer syntax differs from the required one.</w:t>
             </w:r>
           </w:p>
         </w:tc>
@@ -7429,7 +7512,7 @@
         <w:t xml:space="preserve">1.2.840.10008.1.2.1</w:t>
       </w:r>
       <w:r>
-        <w:t xml:space="preserve"> files should require an uncompressed transfer syntax in the server profile: every file on disk is then guaranteed to be in the selected syntax — sent that way by the PACS, or converted on receipt from JPEG Baseline/Extended, JPEG 2000, or the other uncompressed VR — and re-retrieves replace older copies stored in a different syntax. Only when the PACS stores data in a format the application cannot decode either (e.g. JPEG-LS, RLE) does the retrieve abort with an error naming the required syntax; switch back to 'As stored' and use the external viewer integration for such data.</w:t>
+        <w:t xml:space="preserve"> files should require an uncompressed transfer syntax in the server profile: every file on disk is then guaranteed to be in the selected syntax — sent that way by the PACS, or converted on receipt from JPEG Baseline/Extended, JPEG 2000, or the other uncompressed VR — and re-retrieves replace older copies stored in a different syntax. Objects stored in a format the application cannot decode either (e.g. JPEG-LS, RLE) are skipped and reported in the Activity Log while the rest of the study is retrieved; if nothing at all can be delivered in a negotiable syntax, an error dialog names the required syntax — switch back to 'As stored' and use the external viewer integration for such data.</w:t>
       </w:r>
     </w:p>
     <w:p>

</xml_diff>

<commit_message>
Release v1.10.0 — study de-identification via Modification profiles with zip export; tag-level review with Tag Highlights and Profiles; JPEG Lossless display; three-tab Preferences; single-instance tag export; static GCC runtime; tree-collapse and shutdown-hang fixes
Co-Authored-By: Claude Fable 5 <noreply@anthropic.com>
</commit_message>
<xml_diff>
--- a/dicomqr-user-manual.docx
+++ b/dicomqr-user-manual.docx
@@ -71,7 +71,7 @@
           <w:sz w:val="32"/>
           <w:szCs w:val="32"/>
         </w:rPr>
-        <w:t xml:space="preserve">User Manual  v1.9.0</w:t>
+        <w:t xml:space="preserve">User Manual  v1.10.0</w:t>
       </w:r>
     </w:p>
     <w:p>
@@ -85,7 +85,7 @@
           <w:sz w:val="24"/>
           <w:szCs w:val="24"/>
         </w:rPr>
-        <w:t xml:space="preserve">July 24, 2026</w:t>
+        <w:t xml:space="preserve">July 30, 2026</w:t>
       </w:r>
     </w:p>
     <w:p>
@@ -194,7 +194,7 @@
         <w:pStyle w:val="ListBullet"/>
       </w:pPr>
       <w:r>
-        <w:t xml:space="preserve">Preview DICOM images in the built-in viewer with interactive window/level, zoom and pan, modality-specific W/L presets, colour maps for PET/SPECT, DICOM annotation overlays, DICOM overlay plane compositing, and study overview grids; decodes JPEG Baseline, JPEG 2000, and uncompressed pixel data</w:t>
+        <w:t xml:space="preserve">Preview DICOM images in the built-in viewer with interactive window/level, zoom and pan, modality-specific W/L presets, colour maps for PET/SPECT, DICOM annotation overlays, DICOM overlay plane compositing, and study overview grids; decodes JPEG Baseline, JPEG Lossless, JPEG 2000, and uncompressed pixel data</w:t>
       </w:r>
     </w:p>
     <w:p>
@@ -489,7 +489,7 @@
     <w:p/>
     <w:p>
       <w:r>
-        <w:t xml:space="preserve">The AE Title and port can be changed in File &gt; Preferences… &gt; Retrieve.</w:t>
+        <w:t xml:space="preserve">The AE Title and port can be changed in File &gt; Preferences… &gt; SCP &amp; Network.</w:t>
       </w:r>
     </w:p>
     <w:p>
@@ -725,7 +725,7 @@
     </w:p>
     <w:p>
       <w:r>
-        <w:t xml:space="preserve">A server profile stores the connection details for one PACS destination. Profiles are managed in File &gt; Preferences… &gt; Connections. Each profile records:</w:t>
+        <w:t xml:space="preserve">A server profile stores the connection details for one PACS destination. Profiles are managed in File &gt; Preferences… &gt; SCP &amp; Network. Each profile records:</w:t>
       </w:r>
     </w:p>
     <w:tbl>
@@ -1779,7 +1779,7 @@
     </w:p>
     <w:p>
       <w:r>
-        <w:t xml:space="preserve">Click any row in the results tree to select it. Selected rows are highlighted using the colour and font style configured in Preferences &gt; UI (by default, bold in the theme's primary accent colour — see Section 11.1). Click the same row again to deselect it. Multiple rows at any level (patient, study, or series) may be selected simultaneously.</w:t>
+        <w:t xml:space="preserve">Click any row in the results tree to select it. Selected rows are highlighted using the colour and font style configured in Preferences &gt; User Interface (by default, bold in the theme's primary accent colour — see Section 11.1). Click the same row again to deselect it. Multiple rows at any level (patient, study, or series) may be selected simultaneously.</w:t>
       </w:r>
     </w:p>
     <w:p>
@@ -2776,7 +2776,7 @@
     </w:p>
     <w:p>
       <w:r>
-        <w:t xml:space="preserve">Compressed pixel data — the built-in viewer decodes JPEG Baseline, JPEG 2000 (lossless and lossy), and uncompressed (native) pixel data. Files stored in JPEG-LS, JPEG Lossless, or RLE Lossless formats cannot be decoded and display a message suggesting Open in Viewer; to view those, either use an external viewer or require an uncompressed transfer syntax in the server profile before retrieving (see Section 4.1).</w:t>
+        <w:t xml:space="preserve">Compressed pixel data — the built-in viewer decodes JPEG Baseline, JPEG Lossless (Process 14 / SV1, common on ultrasound still captures), JPEG 2000 (lossless and lossy), and uncompressed (native) pixel data. Files stored in JPEG-LS or RLE Lossless formats cannot be decoded and display a message suggesting Open in Viewer; to view those, either use an external viewer or require an uncompressed transfer syntax in the server profile before retrieving (see Section 4.1). Note that JPEG Lossless support is view-only: a retrieve that requires an uncompressed transfer syntax still skips JPEG Lossless objects the server cannot convert (see Section 4.1).</w:t>
       </w:r>
     </w:p>
     <w:p>
@@ -3644,6 +3644,29 @@
     <w:p/>
     <w:p>
       <w:pPr>
+        <w:pStyle w:val="Heading2"/>
+      </w:pPr>
+      <w:r>
+        <w:t>8.8  Tag Review and Export (View Tags)</w:t>
+      </w:r>
+    </w:p>
+    <w:p>
+      <w:r>
+        <w:t xml:space="preserve">Right-click any node and select View Tags to open the tag review window over exactly that node's files. The window presents the Patient → Study → Series → Instance hierarchy with every DICOM element of each instance, sequences nested item by item. Hovering a row shows the tag's DICOM dictionary entry (tag, name, keyword, VR, VM); private tags, malformed VRs, and Tag Profile colours are styled as configured in Preferences (Section 14.2). The search bar filters the tree, Expand All / Collapse All control the branches, right-click offers Copy row and Copy value, and Ctrl+C copies the selected row.</w:t>
+      </w:r>
+    </w:p>
+    <w:p>
+      <w:r>
+        <w:t xml:space="preserve">Right-click an instance row and choose Export Tags… to write that image's complete element list to a CSV or JSON file — this is the application's only export function, deliberately scoped to a single image instance. The export always contains the instance's full tag set: an active search changes what the tree displays, never what is exported. Tags are written as [GGGG,EEEE], each field 4 hexadecimal digits left-filled with 0. CSV produces one row per element with columns Tag, VR, Name, Value; elements nested inside sequences show their path in the Tag column, e.g. [0040,0275] &gt; Item 1 &gt; [0040,0007]. JSON is an array of elements with sequence items nested inside their element. The native save dialog opens directly — the format is chosen with its file-type selector (Save as type). The Default export format preference (Section 14.3) decides which type is listed first and is used when the typed filename has no extension.</w:t>
+      </w:r>
+    </w:p>
+    <w:p>
+      <w:r>
+        <w:t xml:space="preserve">Exported tags use square brackets rather than DICOM's conventional parentheses deliberately: Excel silently parses a parenthesized tag like (0020,0001) as the negative number -20,001 (parentheses read as a negative sign, the comma as a thousands separator), while [0020,0001] is imported as plain text in every locale. The file therefore opens correctly in spreadsheets and stays free of formula artifacts in text editors; the on-screen tag tree keeps the standard (GGGG,EEEE) notation.</w:t>
+      </w:r>
+    </w:p>
+    <w:p>
+      <w:pPr>
         <w:pStyle w:val="Heading1"/>
       </w:pPr>
       <w:r>
@@ -4361,29 +4384,6 @@
           </w:tcPr>
           <w:p>
             <w:r>
-              <w:t xml:space="preserve">Export…</w:t>
-            </w:r>
-          </w:p>
-        </w:tc>
-        <w:tc>
-          <w:tcPr>
-            <w:tcW w:w="6300" w:type="dxa"/>
-          </w:tcPr>
-          <w:p>
-            <w:r>
-              <w:t xml:space="preserve">Saves the current results tree to CSV or JSON.</w:t>
-            </w:r>
-          </w:p>
-        </w:tc>
-      </w:tr>
-      <w:tr>
-        <w:tc>
-          <w:tcPr>
-            <w:tcW w:w="2700" w:type="dxa"/>
-            <w:shd w:val="clear" w:color="auto" w:fill="F5F5F5"/>
-          </w:tcPr>
-          <w:p>
-            <w:r>
               <w:t xml:space="preserve">Retrieve Selected</w:t>
             </w:r>
           </w:p>
@@ -4391,7 +4391,6 @@
         <w:tc>
           <w:tcPr>
             <w:tcW w:w="6300" w:type="dxa"/>
-            <w:shd w:val="clear" w:color="auto" w:fill="F5F5F5"/>
           </w:tcPr>
           <w:p>
             <w:r>
@@ -4404,6 +4403,7 @@
         <w:tc>
           <w:tcPr>
             <w:tcW w:w="2700" w:type="dxa"/>
+            <w:shd w:val="clear" w:color="auto" w:fill="F5F5F5"/>
           </w:tcPr>
           <w:p>
             <w:r>
@@ -4414,6 +4414,7 @@
         <w:tc>
           <w:tcPr>
             <w:tcW w:w="6300" w:type="dxa"/>
+            <w:shd w:val="clear" w:color="auto" w:fill="F5F5F5"/>
           </w:tcPr>
           <w:p>
             <w:r>
@@ -4752,7 +4753,7 @@
     </w:p>
     <w:p>
       <w:r>
-        <w:t xml:space="preserve">Open the Preferences dialog from File &gt; Preferences…. Changes take effect when Apply is clicked and are written immediately to disk.</w:t>
+        <w:t xml:space="preserve">Open the Preferences dialog from File &gt; Preferences…. The dialog is organized into three tabs — SCP &amp; Network, User Interface, and Modification &amp; Export. Changes take effect when Apply is clicked and are written immediately to disk.</w:t>
       </w:r>
     </w:p>
     <w:p>
@@ -4760,7 +4761,12 @@
         <w:pStyle w:val="Heading2"/>
       </w:pPr>
       <w:r>
-        <w:t>14.1  UI Section</w:t>
+        <w:t>14.1  SCP &amp; Network Tab</w:t>
+      </w:r>
+    </w:p>
+    <w:p>
+      <w:r>
+        <w:t xml:space="preserve">Everything DICOM-network related: the identity this workstation presents, where received files go, and the saved server profiles.</w:t>
       </w:r>
     </w:p>
     <w:tbl>
@@ -4828,87 +4834,87 @@
           </w:tcPr>
           <w:p>
             <w:r>
-              <w:t xml:space="preserve">Theme</w:t>
-            </w:r>
-          </w:p>
-        </w:tc>
-        <w:tc>
-          <w:tcPr>
-            <w:tcW w:w="6300" w:type="dxa"/>
-          </w:tcPr>
-          <w:p>
-            <w:r>
-              <w:t xml:space="preserve">Selects the application colour theme: Light or Dark.</w:t>
-            </w:r>
-          </w:p>
-        </w:tc>
-      </w:tr>
-      <w:tr>
-        <w:tc>
-          <w:tcPr>
-            <w:tcW w:w="2700" w:type="dxa"/>
-            <w:shd w:val="clear" w:color="auto" w:fill="F5F5F5"/>
-          </w:tcPr>
-          <w:p>
-            <w:r>
-              <w:t xml:space="preserve">Tree font</w:t>
-            </w:r>
-          </w:p>
-        </w:tc>
-        <w:tc>
-          <w:tcPr>
-            <w:tcW w:w="6300" w:type="dxa"/>
-            <w:shd w:val="clear" w:color="auto" w:fill="F5F5F5"/>
-          </w:tcPr>
-          <w:p>
-            <w:r>
-              <w:t xml:space="preserve">Selects the font used for results tree rows. Select (default) to use the application's built-in font.</w:t>
-            </w:r>
-          </w:p>
-        </w:tc>
-      </w:tr>
-      <w:tr>
-        <w:tc>
-          <w:tcPr>
-            <w:tcW w:w="2700" w:type="dxa"/>
-          </w:tcPr>
-          <w:p>
-            <w:r>
-              <w:t xml:space="preserve">Selection colour</w:t>
-            </w:r>
-          </w:p>
-        </w:tc>
-        <w:tc>
-          <w:tcPr>
-            <w:tcW w:w="6300" w:type="dxa"/>
-          </w:tcPr>
-          <w:p>
-            <w:r>
-              <w:t xml:space="preserve">The colour applied to selected rows. Click Choose colour… to open a colour picker. If unset, selected rows follow the theme's primary accent colour.</w:t>
-            </w:r>
-          </w:p>
-        </w:tc>
-      </w:tr>
-      <w:tr>
-        <w:tc>
-          <w:tcPr>
-            <w:tcW w:w="2700" w:type="dxa"/>
-            <w:shd w:val="clear" w:color="auto" w:fill="F5F5F5"/>
-          </w:tcPr>
-          <w:p>
-            <w:r>
-              <w:t xml:space="preserve">Selection style</w:t>
-            </w:r>
-          </w:p>
-        </w:tc>
-        <w:tc>
-          <w:tcPr>
-            <w:tcW w:w="6300" w:type="dxa"/>
-            <w:shd w:val="clear" w:color="auto" w:fill="F5F5F5"/>
-          </w:tcPr>
-          <w:p>
-            <w:r>
-              <w:t xml:space="preserve">The font style applied to selected rows: Bold and/or Italic.</w:t>
+              <w:t xml:space="preserve">Local AE Title</w:t>
+            </w:r>
+          </w:p>
+        </w:tc>
+        <w:tc>
+          <w:tcPr>
+            <w:tcW w:w="6300" w:type="dxa"/>
+          </w:tcPr>
+          <w:p>
+            <w:r>
+              <w:t xml:space="preserve">The AE Title this workstation presents during DICOM associations. Default: DICOMQR.</w:t>
+            </w:r>
+          </w:p>
+        </w:tc>
+      </w:tr>
+      <w:tr>
+        <w:tc>
+          <w:tcPr>
+            <w:tcW w:w="2700" w:type="dxa"/>
+            <w:shd w:val="clear" w:color="auto" w:fill="F5F5F5"/>
+          </w:tcPr>
+          <w:p>
+            <w:r>
+              <w:t xml:space="preserve">Local SCP port</w:t>
+            </w:r>
+          </w:p>
+        </w:tc>
+        <w:tc>
+          <w:tcPr>
+            <w:tcW w:w="6300" w:type="dxa"/>
+            <w:shd w:val="clear" w:color="auto" w:fill="F5F5F5"/>
+          </w:tcPr>
+          <w:p>
+            <w:r>
+              <w:t xml:space="preserve">The TCP port on which the embedded C-STORE listener accepts incoming connections. Default: 11112.</w:t>
+            </w:r>
+          </w:p>
+        </w:tc>
+      </w:tr>
+      <w:tr>
+        <w:tc>
+          <w:tcPr>
+            <w:tcW w:w="2700" w:type="dxa"/>
+          </w:tcPr>
+          <w:p>
+            <w:r>
+              <w:t xml:space="preserve">Download folder</w:t>
+            </w:r>
+          </w:p>
+        </w:tc>
+        <w:tc>
+          <w:tcPr>
+            <w:tcW w:w="6300" w:type="dxa"/>
+          </w:tcPr>
+          <w:p>
+            <w:r>
+              <w:t xml:space="preserve">The root folder where retrieved and imported DICOM files are written.</w:t>
+            </w:r>
+          </w:p>
+        </w:tc>
+      </w:tr>
+      <w:tr>
+        <w:tc>
+          <w:tcPr>
+            <w:tcW w:w="2700" w:type="dxa"/>
+            <w:shd w:val="clear" w:color="auto" w:fill="F5F5F5"/>
+          </w:tcPr>
+          <w:p>
+            <w:r>
+              <w:t xml:space="preserve">Retrieve stall timeout (s)</w:t>
+            </w:r>
+          </w:p>
+        </w:tc>
+        <w:tc>
+          <w:tcPr>
+            <w:tcW w:w="6300" w:type="dxa"/>
+            <w:shd w:val="clear" w:color="auto" w:fill="F5F5F5"/>
+          </w:tcPr>
+          <w:p>
+            <w:r>
+              <w:t xml:space="preserve">Abort a retrieve when no progress response and no received file arrives for this many seconds. Blank uses the default (120 s); a negative value disables stall detection (e.g. for slow tape archives). See Appendix B.</w:t>
             </w:r>
           </w:p>
         </w:tc>
@@ -4916,16 +4922,13 @@
     </w:tbl>
     <w:p/>
     <w:p>
-      <w:pPr>
-        <w:pStyle w:val="Heading2"/>
-      </w:pPr>
-      <w:r>
-        <w:t>14.2  Connections Section</w:t>
-      </w:r>
-    </w:p>
-    <w:p>
-      <w:r>
-        <w:t xml:space="preserve">Lists all saved server profiles. Click Edit to modify, Delete to remove, or Add server… to create a new profile. The Up/Down buttons reorder the list; the first profile is the default selection when the application starts.</w:t>
+      <w:r>
+        <w:t xml:space="preserve">Changes to AE Title or SCP port take effect the next time a connection is established.</w:t>
+      </w:r>
+    </w:p>
+    <w:p>
+      <w:r>
+        <w:t xml:space="preserve">Server Profiles — lists all saved server profiles. Click Edit to modify, Delete to remove, or Add server… to create a new profile. The Up/Down buttons reorder the list; the first profile is the default selection when the application starts.</w:t>
       </w:r>
     </w:p>
     <w:p>
@@ -5215,7 +5218,12 @@
         <w:pStyle w:val="Heading2"/>
       </w:pPr>
       <w:r>
-        <w:t>14.3  Retrieve Section</w:t>
+        <w:t>14.2  User Interface Tab</w:t>
+      </w:r>
+    </w:p>
+    <w:p>
+      <w:r>
+        <w:t xml:space="preserve">Appearance:</w:t>
       </w:r>
     </w:p>
     <w:tbl>
@@ -5283,63 +5291,87 @@
           </w:tcPr>
           <w:p>
             <w:r>
-              <w:t xml:space="preserve">Local AE Title</w:t>
-            </w:r>
-          </w:p>
-        </w:tc>
-        <w:tc>
-          <w:tcPr>
-            <w:tcW w:w="6300" w:type="dxa"/>
-          </w:tcPr>
-          <w:p>
-            <w:r>
-              <w:t xml:space="preserve">The AE Title this workstation presents during DICOM associations. Default: DICOMQR.</w:t>
-            </w:r>
-          </w:p>
-        </w:tc>
-      </w:tr>
-      <w:tr>
-        <w:tc>
-          <w:tcPr>
-            <w:tcW w:w="2700" w:type="dxa"/>
-            <w:shd w:val="clear" w:color="auto" w:fill="F5F5F5"/>
-          </w:tcPr>
-          <w:p>
-            <w:r>
-              <w:t xml:space="preserve">Local SCP port</w:t>
-            </w:r>
-          </w:p>
-        </w:tc>
-        <w:tc>
-          <w:tcPr>
-            <w:tcW w:w="6300" w:type="dxa"/>
-            <w:shd w:val="clear" w:color="auto" w:fill="F5F5F5"/>
-          </w:tcPr>
-          <w:p>
-            <w:r>
-              <w:t xml:space="preserve">The TCP port on which the embedded C-STORE listener accepts incoming connections. Default: 11112.</w:t>
-            </w:r>
-          </w:p>
-        </w:tc>
-      </w:tr>
-      <w:tr>
-        <w:tc>
-          <w:tcPr>
-            <w:tcW w:w="2700" w:type="dxa"/>
-          </w:tcPr>
-          <w:p>
-            <w:r>
-              <w:t xml:space="preserve">Download folder</w:t>
-            </w:r>
-          </w:p>
-        </w:tc>
-        <w:tc>
-          <w:tcPr>
-            <w:tcW w:w="6300" w:type="dxa"/>
-          </w:tcPr>
-          <w:p>
-            <w:r>
-              <w:t xml:space="preserve">The root folder where retrieved and imported DICOM files are written.</w:t>
+              <w:t xml:space="preserve">Theme</w:t>
+            </w:r>
+          </w:p>
+        </w:tc>
+        <w:tc>
+          <w:tcPr>
+            <w:tcW w:w="6300" w:type="dxa"/>
+          </w:tcPr>
+          <w:p>
+            <w:r>
+              <w:t xml:space="preserve">Selects the application colour theme: Light or Dark.</w:t>
+            </w:r>
+          </w:p>
+        </w:tc>
+      </w:tr>
+      <w:tr>
+        <w:tc>
+          <w:tcPr>
+            <w:tcW w:w="2700" w:type="dxa"/>
+            <w:shd w:val="clear" w:color="auto" w:fill="F5F5F5"/>
+          </w:tcPr>
+          <w:p>
+            <w:r>
+              <w:t xml:space="preserve">Tree font</w:t>
+            </w:r>
+          </w:p>
+        </w:tc>
+        <w:tc>
+          <w:tcPr>
+            <w:tcW w:w="6300" w:type="dxa"/>
+            <w:shd w:val="clear" w:color="auto" w:fill="F5F5F5"/>
+          </w:tcPr>
+          <w:p>
+            <w:r>
+              <w:t xml:space="preserve">Selects the font used for results tree rows. Select (default) to use the application's built-in font.</w:t>
+            </w:r>
+          </w:p>
+        </w:tc>
+      </w:tr>
+      <w:tr>
+        <w:tc>
+          <w:tcPr>
+            <w:tcW w:w="2700" w:type="dxa"/>
+          </w:tcPr>
+          <w:p>
+            <w:r>
+              <w:t xml:space="preserve">Selection colour</w:t>
+            </w:r>
+          </w:p>
+        </w:tc>
+        <w:tc>
+          <w:tcPr>
+            <w:tcW w:w="6300" w:type="dxa"/>
+          </w:tcPr>
+          <w:p>
+            <w:r>
+              <w:t xml:space="preserve">The colour applied to selected rows. Click Choose colour… to open a colour picker. If unset, selected rows follow the theme's primary accent colour.</w:t>
+            </w:r>
+          </w:p>
+        </w:tc>
+      </w:tr>
+      <w:tr>
+        <w:tc>
+          <w:tcPr>
+            <w:tcW w:w="2700" w:type="dxa"/>
+            <w:shd w:val="clear" w:color="auto" w:fill="F5F5F5"/>
+          </w:tcPr>
+          <w:p>
+            <w:r>
+              <w:t xml:space="preserve">Selection style</w:t>
+            </w:r>
+          </w:p>
+        </w:tc>
+        <w:tc>
+          <w:tcPr>
+            <w:tcW w:w="6300" w:type="dxa"/>
+            <w:shd w:val="clear" w:color="auto" w:fill="F5F5F5"/>
+          </w:tcPr>
+          <w:p>
+            <w:r>
+              <w:t xml:space="preserve">The font style applied to selected rows: Bold and/or Italic.</w:t>
             </w:r>
           </w:p>
         </w:tc>
@@ -5348,15 +5380,7 @@
     <w:p/>
     <w:p>
       <w:r>
-        <w:t xml:space="preserve">Changes to AE Title or SCP port take effect the next time a connection is established.</w:t>
-      </w:r>
-    </w:p>
-    <w:p>
-      <w:pPr>
-        <w:pStyle w:val="Heading2"/>
-      </w:pPr>
-      <w:r>
-        <w:t>14.4  Image Viewer Section</w:t>
+        <w:t xml:space="preserve">Image Viewer:</w:t>
       </w:r>
     </w:p>
     <w:tbl>
@@ -5442,16 +5466,8 @@
     </w:tbl>
     <w:p/>
     <w:p>
-      <w:pPr>
-        <w:pStyle w:val="Heading1"/>
-      </w:pPr>
-      <w:r>
-        <w:t>15  Status Bar</w:t>
-      </w:r>
-    </w:p>
-    <w:p>
-      <w:r>
-        <w:t xml:space="preserve">The status bar at the bottom of the window provides real-time feedback. A coloured LED indicator (gray / amber / green) precedes the status text.</w:t>
+      <w:r>
+        <w:t xml:space="preserve">Tag Highlights — styling rules applied in the tag review window (Local Browse right-click &gt; View Tags):</w:t>
       </w:r>
     </w:p>
     <w:tbl>
@@ -5490,7 +5506,7 @@
                 <w:sz w:val="20"/>
                 <w:szCs w:val="20"/>
               </w:rPr>
-              <w:t xml:space="preserve">Situation</w:t>
+              <w:t xml:space="preserve">Setting</w:t>
             </w:r>
           </w:p>
         </w:tc>
@@ -5507,6 +5523,627 @@
                 <w:sz w:val="20"/>
                 <w:szCs w:val="20"/>
               </w:rPr>
+              <w:t xml:space="preserve">Description</w:t>
+            </w:r>
+          </w:p>
+        </w:tc>
+      </w:tr>
+      <w:tr>
+        <w:tc>
+          <w:tcPr>
+            <w:tcW w:w="2700" w:type="dxa"/>
+          </w:tcPr>
+          <w:p>
+            <w:r>
+              <w:t xml:space="preserve">Private tags</w:t>
+            </w:r>
+          </w:p>
+        </w:tc>
+        <w:tc>
+          <w:tcPr>
+            <w:tcW w:w="6300" w:type="dxa"/>
+          </w:tcPr>
+          <w:p>
+            <w:r>
+              <w:t xml:space="preserve">When Italicize is checked, private (odd-group) tags are rendered in italic.</w:t>
+            </w:r>
+          </w:p>
+        </w:tc>
+      </w:tr>
+      <w:tr>
+        <w:tc>
+          <w:tcPr>
+            <w:tcW w:w="2700" w:type="dxa"/>
+            <w:shd w:val="clear" w:color="auto" w:fill="F5F5F5"/>
+          </w:tcPr>
+          <w:p>
+            <w:r>
+              <w:t xml:space="preserve">Malformed tag</w:t>
+            </w:r>
+          </w:p>
+        </w:tc>
+        <w:tc>
+          <w:tcPr>
+            <w:tcW w:w="6300" w:type="dxa"/>
+            <w:shd w:val="clear" w:color="auto" w:fill="F5F5F5"/>
+          </w:tcPr>
+          <w:p>
+            <w:r>
+              <w:t xml:space="preserve">The colour applied to tags whose value representation violates the DICOM standard. Default: red.</w:t>
+            </w:r>
+          </w:p>
+        </w:tc>
+      </w:tr>
+    </w:tbl>
+    <w:p/>
+    <w:p>
+      <w:r>
+        <w:t xml:space="preserve">Tag Profiles — named tag sets coloured in the View Tags window. Each profile has a name, a colour, an enabled checkbox, and a tag list (one GGGG,EEEE per line in the editor). The first enabled profile containing a tag determines its colour; the malformed-tag highlight always takes precedence. The default PHI profile colours protected-health-information tags orange. The JSON wire format matches the dicomhdr application, so profile blocks can be copied between the two tools' settings files.</w:t>
+      </w:r>
+    </w:p>
+    <w:p>
+      <w:pPr>
+        <w:pStyle w:val="Heading2"/>
+      </w:pPr>
+      <w:r>
+        <w:t>14.3  Modification &amp; Export Tab</w:t>
+      </w:r>
+    </w:p>
+    <w:p>
+      <w:r>
+        <w:t xml:space="preserve">Modification Profiles — the de-identification recipes applied from the Local Browse right-click Modification submenu. Profiles are stored in </w:t>
+      </w:r>
+      <w:r>
+        <w:rPr>
+          <w:rFonts w:ascii="Courier New" w:hAnsi="Courier New"/>
+          <w:sz w:val="18"/>
+          <w:szCs w:val="18"/>
+          <w:shd w:val="clear" w:color="auto" w:fill="EBEBEB"/>
+        </w:rPr>
+        <w:t xml:space="preserve">%USERPROFILE%\.dicomqr\profiles.json</w:t>
+      </w:r>
+      <w:r>
+        <w:t xml:space="preserve"> in the same format as the dicomtool CLI, so profile files can be copied between the two tools. The list shows each profile with its set/remove counts and base profile; Edit and Add profile… open the profile editor. Changes are committed to profiles.json only when Apply is clicked, and only when something actually changed — a hand-edited file is never rewritten gratuitously. If profiles.json cannot be parsed, the list is replaced by an explanatory message and Apply leaves the file untouched.</w:t>
+      </w:r>
+    </w:p>
+    <w:p>
+      <w:r>
+        <w:t xml:space="preserve">Deleting a profile that other profiles use as their base prompts for confirmation; renaming a profile automatically updates the base reference in profiles that inherit from it.</w:t>
+      </w:r>
+    </w:p>
+    <w:p>
+      <w:r>
+        <w:t xml:space="preserve">Profile editor fields:</w:t>
+      </w:r>
+    </w:p>
+    <w:tbl>
+      <w:tblPr>
+        <w:tblW w:w="0" w:type="auto"/>
+        <w:tblBorders>
+          <w:top w:val="single" w:sz="4" w:space="0" w:color="BBBBBB"/>
+          <w:left w:val="single" w:sz="4" w:space="0" w:color="BBBBBB"/>
+          <w:bottom w:val="single" w:sz="4" w:space="0" w:color="BBBBBB"/>
+          <w:right w:val="single" w:sz="4" w:space="0" w:color="BBBBBB"/>
+          <w:insideH w:val="single" w:sz="4" w:space="0" w:color="BBBBBB"/>
+          <w:insideV w:val="single" w:sz="4" w:space="0" w:color="BBBBBB"/>
+        </w:tblBorders>
+        <w:tblCellMar>
+          <w:top w:w="80" w:type="dxa"/>
+          <w:left w:w="140" w:type="dxa"/>
+          <w:bottom w:w="80" w:type="dxa"/>
+          <w:right w:w="140" w:type="dxa"/>
+        </w:tblCellMar>
+      </w:tblPr>
+      <w:tblGrid>
+        <w:gridCol w:w="2700"/>
+        <w:gridCol w:w="6300"/>
+      </w:tblGrid>
+      <w:tr>
+        <w:tc>
+          <w:tcPr>
+            <w:tcW w:w="2700" w:type="dxa"/>
+            <w:shd w:val="clear" w:color="auto" w:fill="2E74B5"/>
+          </w:tcPr>
+          <w:p>
+            <w:r>
+              <w:rPr>
+                <w:b/>
+                <w:color w:val="FFFFFF"/>
+                <w:sz w:val="20"/>
+                <w:szCs w:val="20"/>
+              </w:rPr>
+              <w:t xml:space="preserve">Field</w:t>
+            </w:r>
+          </w:p>
+        </w:tc>
+        <w:tc>
+          <w:tcPr>
+            <w:tcW w:w="6300" w:type="dxa"/>
+            <w:shd w:val="clear" w:color="auto" w:fill="2E74B5"/>
+          </w:tcPr>
+          <w:p>
+            <w:r>
+              <w:rPr>
+                <w:b/>
+                <w:color w:val="FFFFFF"/>
+                <w:sz w:val="20"/>
+                <w:szCs w:val="20"/>
+              </w:rPr>
+              <w:t xml:space="preserve">Description</w:t>
+            </w:r>
+          </w:p>
+        </w:tc>
+      </w:tr>
+      <w:tr>
+        <w:tc>
+          <w:tcPr>
+            <w:tcW w:w="2700" w:type="dxa"/>
+          </w:tcPr>
+          <w:p>
+            <w:r>
+              <w:t xml:space="preserve">Profile name</w:t>
+            </w:r>
+          </w:p>
+        </w:tc>
+        <w:tc>
+          <w:tcPr>
+            <w:tcW w:w="6300" w:type="dxa"/>
+          </w:tcPr>
+          <w:p>
+            <w:r>
+              <w:t xml:space="preserve">The name shown in the Modification submenu and used as the base reference by inheriting profiles.</w:t>
+            </w:r>
+          </w:p>
+        </w:tc>
+      </w:tr>
+      <w:tr>
+        <w:tc>
+          <w:tcPr>
+            <w:tcW w:w="2700" w:type="dxa"/>
+            <w:shd w:val="clear" w:color="auto" w:fill="F5F5F5"/>
+          </w:tcPr>
+          <w:p>
+            <w:r>
+              <w:t xml:space="preserve">Base profile</w:t>
+            </w:r>
+          </w:p>
+        </w:tc>
+        <w:tc>
+          <w:tcPr>
+            <w:tcW w:w="6300" w:type="dxa"/>
+            <w:shd w:val="clear" w:color="auto" w:fill="F5F5F5"/>
+          </w:tcPr>
+          <w:p>
+            <w:r>
+              <w:t xml:space="preserve">Another profile whose settings this one inherits and overrides: override wins for scalar values, removals are a union, and this profile's Keep entries subtract from the merged removal list.</w:t>
+            </w:r>
+          </w:p>
+        </w:tc>
+      </w:tr>
+      <w:tr>
+        <w:tc>
+          <w:tcPr>
+            <w:tcW w:w="2700" w:type="dxa"/>
+          </w:tcPr>
+          <w:p>
+            <w:r>
+              <w:t xml:space="preserve">Set values</w:t>
+            </w:r>
+          </w:p>
+        </w:tc>
+        <w:tc>
+          <w:tcPr>
+            <w:tcW w:w="6300" w:type="dxa"/>
+          </w:tcPr>
+          <w:p>
+            <w:r>
+              <w:t xml:space="preserve">One TAG=VALUE per line. TAG is a GGGG,EEEE tag or a tags.json alias (e.g. patient name).</w:t>
+            </w:r>
+          </w:p>
+        </w:tc>
+      </w:tr>
+      <w:tr>
+        <w:tc>
+          <w:tcPr>
+            <w:tcW w:w="2700" w:type="dxa"/>
+            <w:shd w:val="clear" w:color="auto" w:fill="F5F5F5"/>
+          </w:tcPr>
+          <w:p>
+            <w:r>
+              <w:t xml:space="preserve">Remove tags</w:t>
+            </w:r>
+          </w:p>
+        </w:tc>
+        <w:tc>
+          <w:tcPr>
+            <w:tcW w:w="6300" w:type="dxa"/>
+            <w:shd w:val="clear" w:color="auto" w:fill="F5F5F5"/>
+          </w:tcPr>
+          <w:p>
+            <w:r>
+              <w:t xml:space="preserve">Tags deleted from every file — one tag or alias per line.</w:t>
+            </w:r>
+          </w:p>
+        </w:tc>
+      </w:tr>
+      <w:tr>
+        <w:tc>
+          <w:tcPr>
+            <w:tcW w:w="2700" w:type="dxa"/>
+          </w:tcPr>
+          <w:p>
+            <w:r>
+              <w:t xml:space="preserve">Keep tags</w:t>
+            </w:r>
+          </w:p>
+        </w:tc>
+        <w:tc>
+          <w:tcPr>
+            <w:tcW w:w="6300" w:type="dxa"/>
+          </w:tcPr>
+          <w:p>
+            <w:r>
+              <w:t xml:space="preserve">Tags retained even when the base profile removes them.</w:t>
+            </w:r>
+          </w:p>
+        </w:tc>
+      </w:tr>
+      <w:tr>
+        <w:tc>
+          <w:tcPr>
+            <w:tcW w:w="2700" w:type="dxa"/>
+            <w:shd w:val="clear" w:color="auto" w:fill="F5F5F5"/>
+          </w:tcPr>
+          <w:p>
+            <w:r>
+              <w:t xml:space="preserve">Birth date mask</w:t>
+            </w:r>
+          </w:p>
+        </w:tc>
+        <w:tc>
+          <w:tcPr>
+            <w:tcW w:w="6300" w:type="dxa"/>
+            <w:shd w:val="clear" w:color="auto" w:fill="F5F5F5"/>
+          </w:tcPr>
+          <w:p>
+            <w:r>
+              <w:t xml:space="preserve">8-character positional pattern applied to Patient Birth Date: digit positions replace, any other character preserves the original digit (e.g. YYYY0101 keeps the year and sets January 1st). Empty = no masking.</w:t>
+            </w:r>
+          </w:p>
+        </w:tc>
+      </w:tr>
+      <w:tr>
+        <w:tc>
+          <w:tcPr>
+            <w:tcW w:w="2700" w:type="dxa"/>
+          </w:tcPr>
+          <w:p>
+            <w:r>
+              <w:t xml:space="preserve">UID suffix</w:t>
+            </w:r>
+          </w:p>
+        </w:tc>
+        <w:tc>
+          <w:tcPr>
+            <w:tcW w:w="6300" w:type="dxa"/>
+          </w:tcPr>
+          <w:p>
+            <w:r>
+              <w:t xml:space="preserve">Digits 1-9 appended to site-generated UIDs. Empty = none. Cannot be combined with Remap UIDs.</w:t>
+            </w:r>
+          </w:p>
+        </w:tc>
+      </w:tr>
+      <w:tr>
+        <w:tc>
+          <w:tcPr>
+            <w:tcW w:w="2700" w:type="dxa"/>
+            <w:shd w:val="clear" w:color="auto" w:fill="F5F5F5"/>
+          </w:tcPr>
+          <w:p>
+            <w:r>
+              <w:t xml:space="preserve">Remap UIDs</w:t>
+            </w:r>
+          </w:p>
+        </w:tc>
+        <w:tc>
+          <w:tcPr>
+            <w:tcW w:w="6300" w:type="dxa"/>
+            <w:shd w:val="clear" w:color="auto" w:fill="F5F5F5"/>
+          </w:tcPr>
+          <w:p>
+            <w:r>
+              <w:t xml:space="preserve">Replace every site-generated UID with a fresh consistent value — the same source UID always maps to the same replacement within a run, keeping cross-references intact. Standard and structural UIDs are never touched.</w:t>
+            </w:r>
+          </w:p>
+        </w:tc>
+      </w:tr>
+      <w:tr>
+        <w:tc>
+          <w:tcPr>
+            <w:tcW w:w="2700" w:type="dxa"/>
+          </w:tcPr>
+          <w:p>
+            <w:r>
+              <w:t xml:space="preserve">Remove private tags</w:t>
+            </w:r>
+          </w:p>
+        </w:tc>
+        <w:tc>
+          <w:tcPr>
+            <w:tcW w:w="6300" w:type="dxa"/>
+          </w:tcPr>
+          <w:p>
+            <w:r>
+              <w:t xml:space="preserve">Delete all private (odd-group) tags.</w:t>
+            </w:r>
+          </w:p>
+        </w:tc>
+      </w:tr>
+      <w:tr>
+        <w:tc>
+          <w:tcPr>
+            <w:tcW w:w="2700" w:type="dxa"/>
+            <w:shd w:val="clear" w:color="auto" w:fill="F5F5F5"/>
+          </w:tcPr>
+          <w:p>
+            <w:r>
+              <w:t xml:space="preserve">Keep private tags</w:t>
+            </w:r>
+          </w:p>
+        </w:tc>
+        <w:tc>
+          <w:tcPr>
+            <w:tcW w:w="6300" w:type="dxa"/>
+            <w:shd w:val="clear" w:color="auto" w:fill="F5F5F5"/>
+          </w:tcPr>
+          <w:p>
+            <w:r>
+              <w:t xml:space="preserve">Retain private tags even when a base profile removes them.</w:t>
+            </w:r>
+          </w:p>
+        </w:tc>
+      </w:tr>
+      <w:tr>
+        <w:tc>
+          <w:tcPr>
+            <w:tcW w:w="2700" w:type="dxa"/>
+          </w:tcPr>
+          <w:p>
+            <w:r>
+              <w:t xml:space="preserve">Mask top pixel rows</w:t>
+            </w:r>
+          </w:p>
+        </w:tc>
+        <w:tc>
+          <w:tcPr>
+            <w:tcW w:w="6300" w:type="dxa"/>
+          </w:tcPr>
+          <w:p>
+            <w:r>
+              <w:t xml:space="preserve">Blank out this many rows at the top of the pixel data (burned-in annotations).</w:t>
+            </w:r>
+          </w:p>
+        </w:tc>
+      </w:tr>
+      <w:tr>
+        <w:tc>
+          <w:tcPr>
+            <w:tcW w:w="2700" w:type="dxa"/>
+            <w:shd w:val="clear" w:color="auto" w:fill="F5F5F5"/>
+          </w:tcPr>
+          <w:p>
+            <w:r>
+              <w:t xml:space="preserve">Fix VR</w:t>
+            </w:r>
+          </w:p>
+        </w:tc>
+        <w:tc>
+          <w:tcPr>
+            <w:tcW w:w="6300" w:type="dxa"/>
+            <w:shd w:val="clear" w:color="auto" w:fill="F5F5F5"/>
+          </w:tcPr>
+          <w:p>
+            <w:r>
+              <w:t xml:space="preserve">Handling of value-representation violations: (off), correct, skip, or passthrough.</w:t>
+            </w:r>
+          </w:p>
+        </w:tc>
+      </w:tr>
+    </w:tbl>
+    <w:p/>
+    <w:p>
+      <w:r>
+        <w:t xml:space="preserve">Profiles may additionally define per-modality overrides, ignoretype / ignoremodality filters, and the dicomdir and verbose flags. These have no dialog controls — the editor lists them in an italic note and preserves them unchanged, so hand-authored (or dicomtool-authored) settings survive a round-trip through the editor.</w:t>
+      </w:r>
+    </w:p>
+    <w:p>
+      <w:r>
+        <w:t xml:space="preserve">Defaults:</w:t>
+      </w:r>
+    </w:p>
+    <w:tbl>
+      <w:tblPr>
+        <w:tblW w:w="0" w:type="auto"/>
+        <w:tblBorders>
+          <w:top w:val="single" w:sz="4" w:space="0" w:color="BBBBBB"/>
+          <w:left w:val="single" w:sz="4" w:space="0" w:color="BBBBBB"/>
+          <w:bottom w:val="single" w:sz="4" w:space="0" w:color="BBBBBB"/>
+          <w:right w:val="single" w:sz="4" w:space="0" w:color="BBBBBB"/>
+          <w:insideH w:val="single" w:sz="4" w:space="0" w:color="BBBBBB"/>
+          <w:insideV w:val="single" w:sz="4" w:space="0" w:color="BBBBBB"/>
+        </w:tblBorders>
+        <w:tblCellMar>
+          <w:top w:w="80" w:type="dxa"/>
+          <w:left w:w="140" w:type="dxa"/>
+          <w:bottom w:w="80" w:type="dxa"/>
+          <w:right w:w="140" w:type="dxa"/>
+        </w:tblCellMar>
+      </w:tblPr>
+      <w:tblGrid>
+        <w:gridCol w:w="2700"/>
+        <w:gridCol w:w="6300"/>
+      </w:tblGrid>
+      <w:tr>
+        <w:tc>
+          <w:tcPr>
+            <w:tcW w:w="2700" w:type="dxa"/>
+            <w:shd w:val="clear" w:color="auto" w:fill="2E74B5"/>
+          </w:tcPr>
+          <w:p>
+            <w:r>
+              <w:rPr>
+                <w:b/>
+                <w:color w:val="FFFFFF"/>
+                <w:sz w:val="20"/>
+                <w:szCs w:val="20"/>
+              </w:rPr>
+              <w:t xml:space="preserve">Setting</w:t>
+            </w:r>
+          </w:p>
+        </w:tc>
+        <w:tc>
+          <w:tcPr>
+            <w:tcW w:w="6300" w:type="dxa"/>
+            <w:shd w:val="clear" w:color="auto" w:fill="2E74B5"/>
+          </w:tcPr>
+          <w:p>
+            <w:r>
+              <w:rPr>
+                <w:b/>
+                <w:color w:val="FFFFFF"/>
+                <w:sz w:val="20"/>
+                <w:szCs w:val="20"/>
+              </w:rPr>
+              <w:t xml:space="preserve">Description</w:t>
+            </w:r>
+          </w:p>
+        </w:tc>
+      </w:tr>
+      <w:tr>
+        <w:tc>
+          <w:tcPr>
+            <w:tcW w:w="2700" w:type="dxa"/>
+          </w:tcPr>
+          <w:p>
+            <w:r>
+              <w:t xml:space="preserve">Default output folder</w:t>
+            </w:r>
+          </w:p>
+        </w:tc>
+        <w:tc>
+          <w:tcPr>
+            <w:tcW w:w="6300" w:type="dxa"/>
+          </w:tcPr>
+          <w:p>
+            <w:r>
+              <w:t xml:space="preserve">Where modification exports are written. When set, the Modification dialog uses it directly — no folder picker appears; the dialog's Change… button overrides it for a single run. When empty, the dialog asks on the first run and saves that choice here. Must be outside the download folder — modified files are never mixed into the local index.</w:t>
+            </w:r>
+          </w:p>
+        </w:tc>
+      </w:tr>
+      <w:tr>
+        <w:tc>
+          <w:tcPr>
+            <w:tcW w:w="2700" w:type="dxa"/>
+            <w:shd w:val="clear" w:color="auto" w:fill="F5F5F5"/>
+          </w:tcPr>
+          <w:p>
+            <w:r>
+              <w:t xml:space="preserve">Default export format</w:t>
+            </w:r>
+          </w:p>
+        </w:tc>
+        <w:tc>
+          <w:tcPr>
+            <w:tcW w:w="6300" w:type="dxa"/>
+            <w:shd w:val="clear" w:color="auto" w:fill="F5F5F5"/>
+          </w:tcPr>
+          <w:p>
+            <w:r>
+              <w:t xml:space="preserve">The file type listed first in the View Tags Export Tags… save dialog, and the format used when the typed filename has no extension (Section 8.8).</w:t>
+            </w:r>
+          </w:p>
+        </w:tc>
+      </w:tr>
+    </w:tbl>
+    <w:p/>
+    <w:p>
+      <w:r>
+        <w:t xml:space="preserve">Running a modification (Local Browse right-click &gt; Modification &gt; profile) writes the export to &lt;output folder&gt;\&lt;export folder name&gt;. The export folder name is entered in the confirmation dialog — a profile-name-plus-timestamp suggestion is pre-filled, and typing a value into the dialog's Patient Name set field auto-fills the Patient ID set field and the export folder name with the same value, since all three usually carry the new anonymized identity; a field stops following the moment it is edited directly, so the auto-filled values can simply be overtyped. The original patient and study folder names are never reused, because they often contain PHI (patient name, MRN, study description, dates). Inside the export folder a study-level run keeps only the series subfolders, and a patient-level run replaces each study folder with a generic study-01, study-02, … in sorted order.</w:t>
+      </w:r>
+    </w:p>
+    <w:p>
+      <w:r>
+        <w:t xml:space="preserve">Checking Zip export in the dialog writes the run into a single compressed &lt;output folder&gt;\&lt;export folder name&gt;.zip instead of a folder, with the same PHI-safe layout inside the archive. The archive is assembled as a hidden temporary file and renamed into place when the run finishes, so a cancelled run keeps the files completed before the cancel, while a run that writes nothing — or fails while finalizing the archive — leaves no zip behind. An existing zip of the same name is replaced after confirmation.</w:t>
+      </w:r>
+    </w:p>
+    <w:p>
+      <w:pPr>
+        <w:pStyle w:val="Heading1"/>
+      </w:pPr>
+      <w:r>
+        <w:t>15  Status Bar</w:t>
+      </w:r>
+    </w:p>
+    <w:p>
+      <w:r>
+        <w:t xml:space="preserve">The status bar at the bottom of the window provides real-time feedback. A coloured LED indicator (gray / amber / green) precedes the status text.</w:t>
+      </w:r>
+    </w:p>
+    <w:tbl>
+      <w:tblPr>
+        <w:tblW w:w="0" w:type="auto"/>
+        <w:tblBorders>
+          <w:top w:val="single" w:sz="4" w:space="0" w:color="BBBBBB"/>
+          <w:left w:val="single" w:sz="4" w:space="0" w:color="BBBBBB"/>
+          <w:bottom w:val="single" w:sz="4" w:space="0" w:color="BBBBBB"/>
+          <w:right w:val="single" w:sz="4" w:space="0" w:color="BBBBBB"/>
+          <w:insideH w:val="single" w:sz="4" w:space="0" w:color="BBBBBB"/>
+          <w:insideV w:val="single" w:sz="4" w:space="0" w:color="BBBBBB"/>
+        </w:tblBorders>
+        <w:tblCellMar>
+          <w:top w:w="80" w:type="dxa"/>
+          <w:left w:w="140" w:type="dxa"/>
+          <w:bottom w:w="80" w:type="dxa"/>
+          <w:right w:w="140" w:type="dxa"/>
+        </w:tblCellMar>
+      </w:tblPr>
+      <w:tblGrid>
+        <w:gridCol w:w="2700"/>
+        <w:gridCol w:w="6300"/>
+      </w:tblGrid>
+      <w:tr>
+        <w:tc>
+          <w:tcPr>
+            <w:tcW w:w="2700" w:type="dxa"/>
+            <w:shd w:val="clear" w:color="auto" w:fill="2E74B5"/>
+          </w:tcPr>
+          <w:p>
+            <w:r>
+              <w:rPr>
+                <w:b/>
+                <w:color w:val="FFFFFF"/>
+                <w:sz w:val="20"/>
+                <w:szCs w:val="20"/>
+              </w:rPr>
+              <w:t xml:space="preserve">Situation</w:t>
+            </w:r>
+          </w:p>
+        </w:tc>
+        <w:tc>
+          <w:tcPr>
+            <w:tcW w:w="6300" w:type="dxa"/>
+            <w:shd w:val="clear" w:color="auto" w:fill="2E74B5"/>
+          </w:tcPr>
+          <w:p>
+            <w:r>
+              <w:rPr>
+                <w:b/>
+                <w:color w:val="FFFFFF"/>
+                <w:sz w:val="20"/>
+                <w:szCs w:val="20"/>
+              </w:rPr>
               <w:t xml:space="preserve">Status bar text</w:t>
             </w:r>
           </w:p>
@@ -5535,7 +6172,7 @@
                 <w:szCs w:val="18"/>
                 <w:shd w:val="clear" w:color="auto" w:fill="EBEBEB"/>
               </w:rPr>
-              <w:t xml:space="preserve">v1.9.0</w:t>
+              <w:t xml:space="preserve">v1.10.0</w:t>
             </w:r>
           </w:p>
         </w:tc>
@@ -6601,6 +7238,97 @@
                 <w:szCs w:val="18"/>
                 <w:shd w:val="clear" w:color="auto" w:fill="EBEBEB"/>
               </w:rPr>
+              <w:t xml:space="preserve">modifyOutputDir</w:t>
+            </w:r>
+          </w:p>
+        </w:tc>
+        <w:tc>
+          <w:tcPr>
+            <w:tcW w:w="1600" w:type="dxa"/>
+            <w:shd w:val="clear" w:color="auto" w:fill="F5F5F5"/>
+          </w:tcPr>
+          <w:p>
+            <w:r>
+              <w:rPr>
+                <w:rFonts w:ascii="Courier New" w:hAnsi="Courier New"/>
+                <w:sz w:val="18"/>
+                <w:szCs w:val="18"/>
+                <w:shd w:val="clear" w:color="auto" w:fill="EBEBEB"/>
+              </w:rPr>
+              <w:t xml:space="preserve">""</w:t>
+            </w:r>
+          </w:p>
+        </w:tc>
+        <w:tc>
+          <w:tcPr>
+            <w:tcW w:w="5200" w:type="dxa"/>
+            <w:shd w:val="clear" w:color="auto" w:fill="F5F5F5"/>
+          </w:tcPr>
+          <w:p>
+            <w:r>
+              <w:t xml:space="preserve">Default output folder for modification exports, used directly by the Modification dialog. Must be outside the download folder. Empty = the dialog asks once and saves the choice here.</w:t>
+            </w:r>
+          </w:p>
+        </w:tc>
+      </w:tr>
+      <w:tr>
+        <w:tc>
+          <w:tcPr>
+            <w:tcW w:w="2200" w:type="dxa"/>
+          </w:tcPr>
+          <w:p>
+            <w:r>
+              <w:rPr>
+                <w:rFonts w:ascii="Courier New" w:hAnsi="Courier New"/>
+                <w:sz w:val="18"/>
+                <w:szCs w:val="18"/>
+                <w:shd w:val="clear" w:color="auto" w:fill="EBEBEB"/>
+              </w:rPr>
+              <w:t xml:space="preserve">exportFormat</w:t>
+            </w:r>
+          </w:p>
+        </w:tc>
+        <w:tc>
+          <w:tcPr>
+            <w:tcW w:w="1600" w:type="dxa"/>
+          </w:tcPr>
+          <w:p>
+            <w:r>
+              <w:rPr>
+                <w:rFonts w:ascii="Courier New" w:hAnsi="Courier New"/>
+                <w:sz w:val="18"/>
+                <w:szCs w:val="18"/>
+                <w:shd w:val="clear" w:color="auto" w:fill="EBEBEB"/>
+              </w:rPr>
+              <w:t xml:space="preserve">"csv"</w:t>
+            </w:r>
+          </w:p>
+        </w:tc>
+        <w:tc>
+          <w:tcPr>
+            <w:tcW w:w="5200" w:type="dxa"/>
+          </w:tcPr>
+          <w:p>
+            <w:r>
+              <w:t xml:space="preserve">File type listed first in the View Tags Export Tags… save dialog ("csv" or "json"); also the format applied when the typed filename has no extension.</w:t>
+            </w:r>
+          </w:p>
+        </w:tc>
+      </w:tr>
+      <w:tr>
+        <w:tc>
+          <w:tcPr>
+            <w:tcW w:w="2200" w:type="dxa"/>
+            <w:shd w:val="clear" w:color="auto" w:fill="F5F5F5"/>
+          </w:tcPr>
+          <w:p>
+            <w:r>
+              <w:rPr>
+                <w:rFonts w:ascii="Courier New" w:hAnsi="Courier New"/>
+                <w:sz w:val="18"/>
+                <w:szCs w:val="18"/>
+                <w:shd w:val="clear" w:color="auto" w:fill="EBEBEB"/>
+              </w:rPr>
               <w:t xml:space="preserve">viewerPath</w:t>
             </w:r>
           </w:p>
@@ -6902,7 +7630,7 @@
           </w:tcPr>
           <w:p>
             <w:r>
-              <w:t xml:space="preserve">Abort a retrieve when no progress response and no received file arrives for this many seconds. 0 uses the default (120 s); -1 disables stall detection. Recovers from PACS servers whose C-MOVE agent hangs on non-image objects (SR/PR).</w:t>
+              <w:t xml:space="preserve">Abort a retrieve when no progress response and no received file arrives for this many seconds. 0 uses the default (120 s); -1 disables stall detection. Recovers from PACS servers whose C-MOVE agent hangs on non-image objects (SR/PR). Editable in Preferences &gt; SCP &amp; Network.</w:t>
             </w:r>
           </w:p>
         </w:tc>
@@ -6920,6 +7648,136 @@
                 <w:szCs w:val="18"/>
                 <w:shd w:val="clear" w:color="auto" w:fill="EBEBEB"/>
               </w:rPr>
+              <w:t xml:space="preserve">italicPrivate</w:t>
+            </w:r>
+          </w:p>
+        </w:tc>
+        <w:tc>
+          <w:tcPr>
+            <w:tcW w:w="1600" w:type="dxa"/>
+          </w:tcPr>
+          <w:p>
+            <w:r>
+              <w:rPr>
+                <w:rFonts w:ascii="Courier New" w:hAnsi="Courier New"/>
+                <w:sz w:val="18"/>
+                <w:szCs w:val="18"/>
+                <w:shd w:val="clear" w:color="auto" w:fill="EBEBEB"/>
+              </w:rPr>
+              <w:t xml:space="preserve">true</w:t>
+            </w:r>
+          </w:p>
+        </w:tc>
+        <w:tc>
+          <w:tcPr>
+            <w:tcW w:w="5200" w:type="dxa"/>
+          </w:tcPr>
+          <w:p>
+            <w:r>
+              <w:t xml:space="preserve">Render private tags in italic in the View Tags window.</w:t>
+            </w:r>
+          </w:p>
+        </w:tc>
+      </w:tr>
+      <w:tr>
+        <w:tc>
+          <w:tcPr>
+            <w:tcW w:w="2200" w:type="dxa"/>
+            <w:shd w:val="clear" w:color="auto" w:fill="F5F5F5"/>
+          </w:tcPr>
+          <w:p>
+            <w:r>
+              <w:rPr>
+                <w:rFonts w:ascii="Courier New" w:hAnsi="Courier New"/>
+                <w:sz w:val="18"/>
+                <w:szCs w:val="18"/>
+                <w:shd w:val="clear" w:color="auto" w:fill="EBEBEB"/>
+              </w:rPr>
+              <w:t xml:space="preserve">malformedColor</w:t>
+            </w:r>
+          </w:p>
+        </w:tc>
+        <w:tc>
+          <w:tcPr>
+            <w:tcW w:w="1600" w:type="dxa"/>
+            <w:shd w:val="clear" w:color="auto" w:fill="F5F5F5"/>
+          </w:tcPr>
+          <w:p>
+            <w:r>
+              <w:rPr>
+                <w:rFonts w:ascii="Courier New" w:hAnsi="Courier New"/>
+                <w:sz w:val="18"/>
+                <w:szCs w:val="18"/>
+                <w:shd w:val="clear" w:color="auto" w:fill="EBEBEB"/>
+              </w:rPr>
+              <w:t xml:space="preserve">"E54545FF"</w:t>
+            </w:r>
+          </w:p>
+        </w:tc>
+        <w:tc>
+          <w:tcPr>
+            <w:tcW w:w="5200" w:type="dxa"/>
+            <w:shd w:val="clear" w:color="auto" w:fill="F5F5F5"/>
+          </w:tcPr>
+          <w:p>
+            <w:r>
+              <w:t xml:space="preserve">RRGGBBAA colour for tags whose value representation violates the standard.</w:t>
+            </w:r>
+          </w:p>
+        </w:tc>
+      </w:tr>
+      <w:tr>
+        <w:tc>
+          <w:tcPr>
+            <w:tcW w:w="2200" w:type="dxa"/>
+          </w:tcPr>
+          <w:p>
+            <w:r>
+              <w:rPr>
+                <w:rFonts w:ascii="Courier New" w:hAnsi="Courier New"/>
+                <w:sz w:val="18"/>
+                <w:szCs w:val="18"/>
+                <w:shd w:val="clear" w:color="auto" w:fill="EBEBEB"/>
+              </w:rPr>
+              <w:t xml:space="preserve">tagProfiles</w:t>
+            </w:r>
+          </w:p>
+        </w:tc>
+        <w:tc>
+          <w:tcPr>
+            <w:tcW w:w="1600" w:type="dxa"/>
+          </w:tcPr>
+          <w:p>
+            <w:r>
+              <w:t xml:space="preserve">PHI profile</w:t>
+            </w:r>
+          </w:p>
+        </w:tc>
+        <w:tc>
+          <w:tcPr>
+            <w:tcW w:w="5200" w:type="dxa"/>
+          </w:tcPr>
+          <w:p>
+            <w:r>
+              <w:t xml:space="preserve">Array of tag-highlight profiles (name, colour, enabled, tag list) — see Section 14.2. Wire format matches dicomhdr.</w:t>
+            </w:r>
+          </w:p>
+        </w:tc>
+      </w:tr>
+      <w:tr>
+        <w:tc>
+          <w:tcPr>
+            <w:tcW w:w="2200" w:type="dxa"/>
+            <w:shd w:val="clear" w:color="auto" w:fill="F5F5F5"/>
+          </w:tcPr>
+          <w:p>
+            <w:r>
+              <w:rPr>
+                <w:rFonts w:ascii="Courier New" w:hAnsi="Courier New"/>
+                <w:sz w:val="18"/>
+                <w:szCs w:val="18"/>
+                <w:shd w:val="clear" w:color="auto" w:fill="EBEBEB"/>
+              </w:rPr>
               <w:t xml:space="preserve">profiles</w:t>
             </w:r>
           </w:p>
@@ -6927,6 +7785,7 @@
         <w:tc>
           <w:tcPr>
             <w:tcW w:w="1600" w:type="dxa"/>
+            <w:shd w:val="clear" w:color="auto" w:fill="F5F5F5"/>
           </w:tcPr>
           <w:p>
             <w:r>
@@ -6943,6 +7802,7 @@
         <w:tc>
           <w:tcPr>
             <w:tcW w:w="5200" w:type="dxa"/>
+            <w:shd w:val="clear" w:color="auto" w:fill="F5F5F5"/>
           </w:tcPr>
           <w:p>
             <w:r>
@@ -7488,7 +8348,7 @@
     </w:p>
     <w:p>
       <w:r>
-        <w:t xml:space="preserve">Compressed pixel data — the built-in viewer decodes JPEG Baseline and JPEG 2000. Downstream consumers that require </w:t>
+        <w:t xml:space="preserve">Compressed pixel data — the built-in viewer decodes JPEG Baseline, JPEG Lossless, and JPEG 2000. Downstream consumers that require </w:t>
       </w:r>
       <w:r>
         <w:rPr>
@@ -7512,7 +8372,7 @@
         <w:t xml:space="preserve">1.2.840.10008.1.2.1</w:t>
       </w:r>
       <w:r>
-        <w:t xml:space="preserve"> files should require an uncompressed transfer syntax in the server profile: every file on disk is then guaranteed to be in the selected syntax — sent that way by the PACS, or converted on receipt from JPEG Baseline/Extended, JPEG 2000, or the other uncompressed VR — and re-retrieves replace older copies stored in a different syntax. Objects stored in a format the application cannot decode either (e.g. JPEG-LS, RLE) are skipped and reported in the Activity Log while the rest of the study is retrieved; if nothing at all can be delivered in a negotiable syntax, an error dialog names the required syntax — switch back to 'As stored' and use the external viewer integration for such data.</w:t>
+        <w:t xml:space="preserve"> files should require an uncompressed transfer syntax in the server profile: every file on disk is then guaranteed to be in the selected syntax — sent that way by the PACS, or converted on receipt from JPEG Baseline/Extended, JPEG 2000, or the other uncompressed VR — and re-retrieves replace older copies stored in a different syntax. Objects stored in a format the receive path cannot convert (e.g. JPEG-LS, JPEG Lossless, RLE) are skipped and reported in the Activity Log while the rest of the study is retrieved; if nothing at all can be delivered in a negotiable syntax, an error dialog names the required syntax — switch back to 'As stored' and use the external viewer integration for such data.</w:t>
       </w:r>
     </w:p>
     <w:p>
@@ -7522,19 +8382,7 @@
     </w:p>
     <w:p>
       <w:r>
-        <w:t xml:space="preserve">Retrieve stalls on non-image series — some PACS servers' C-MOVE agents fail while sending objects without pixel data (Structured Reports, Presentation States, encapsulated PDFs): the association stays open but no further data ever arrives. dicomqr detects this — if no progress response and no received file arrives for 120 seconds (configurable via </w:t>
-      </w:r>
-      <w:r>
-        <w:rPr>
-          <w:rFonts w:ascii="Courier New" w:hAnsi="Courier New"/>
-          <w:sz w:val="18"/>
-          <w:szCs w:val="18"/>
-          <w:shd w:val="clear" w:color="auto" w:fill="EBEBEB"/>
-        </w:rPr>
-        <w:t xml:space="preserve">retrieveStallTimeoutSec</w:t>
-      </w:r>
-      <w:r>
-        <w:t xml:space="preserve"> in settings.json), the retrieve is aborted with an explanatory message rather than hanging forever. If a server does this repeatedly, set the profile's Retrieve method to C-GET or Auto — the same servers usually deliver non-image objects correctly over C-GET. For genuinely slow servers (e.g. tape archives), raise the timeout, or set it to -1 to disable stall detection.</w:t>
+        <w:t xml:space="preserve">Retrieve stalls on non-image series — some PACS servers' C-MOVE agents fail while sending objects without pixel data (Structured Reports, Presentation States, encapsulated PDFs): the association stays open but no further data ever arrives. dicomqr detects this — if no progress response and no received file arrives for 120 seconds (configurable via the Retrieve stall timeout in Preferences &gt; SCP &amp; Network), the retrieve is aborted with an explanatory message rather than hanging forever. If a server does this repeatedly, set the profile's Retrieve method to C-GET or Auto — the same servers usually deliver non-image objects correctly over C-GET. For genuinely slow servers (e.g. tape archives), raise the timeout, or set it negative to disable stall detection.</w:t>
       </w:r>
     </w:p>
     <w:p>
@@ -7551,16 +8399,16 @@
       </w:r>
     </w:p>
     <w:p>
+      <w:r>
+        <w:t xml:space="preserve">dicomqr is a human–AI collaboration. Credit is given by role, reflecting how the work was actually divided.</w:t>
+      </w:r>
+    </w:p>
+    <w:p>
       <w:pPr>
         <w:pStyle w:val="Heading2"/>
       </w:pPr>
       <w:r>
-        <w:t>Developer</w:t>
-      </w:r>
-    </w:p>
-    <w:p>
-      <w:r>
-        <w:t xml:space="preserve">Jeffrey Leal</w:t>
+        <w:t>Architecture and Direction — Jeffrey Leal</w:t>
       </w:r>
     </w:p>
     <w:p>
@@ -7574,16 +8422,21 @@
       </w:r>
     </w:p>
     <w:p>
+      <w:r>
+        <w:t xml:space="preserve">Program concept and architecture, feature design and requirements, field testing against clinical PACS systems, and release decisions. The application is built, tested, and published by Jeffrey Leal, who remains responsible for the software.</w:t>
+      </w:r>
+    </w:p>
+    <w:p>
       <w:pPr>
         <w:pStyle w:val="Heading2"/>
       </w:pPr>
       <w:r>
-        <w:t>AI Assistance</w:t>
-      </w:r>
-    </w:p>
-    <w:p>
-      <w:r>
-        <w:t xml:space="preserve">This application was designed and developed with the assistance of Claude Sonnet 4.6 by Anthropic, accessed through Claude Code (https://claude.ai/code). Architecture planning, code generation, DICOM standard research, and documentation were produced in collaboration with Claude Code.</w:t>
+        <w:t>Implementation — Claude by Anthropic</w:t>
+      </w:r>
+    </w:p>
+    <w:p>
+      <w:r>
+        <w:t xml:space="preserve">All application code, tests, and documentation were written by Claude (https://www.anthropic.com) through Claude Code (https://claude.ai/code), working to Jeffrey Leal's architecture and direction — code generation, DICOM standard research, debugging against field evidence, and this manual.</w:t>
       </w:r>
     </w:p>
     <w:p>

</xml_diff>

<commit_message>
Release v1.11.0 — verbatim raw-bytes C-STORE push (DICOM library policy Phase 1); step-wise Activity Log severity filtering; Adwaita and Catppuccin colour themes; NM multiframe preview fix; modality placeholder tiles
Co-Authored-By: Claude Fable 5 <noreply@anthropic.com>
</commit_message>
<xml_diff>
--- a/dicomqr-user-manual.docx
+++ b/dicomqr-user-manual.docx
@@ -71,7 +71,7 @@
           <w:sz w:val="32"/>
           <w:szCs w:val="32"/>
         </w:rPr>
-        <w:t xml:space="preserve">User Manual  v1.10.0</w:t>
+        <w:t xml:space="preserve">User Manual  v1.11.0</w:t>
       </w:r>
     </w:p>
     <w:p>
@@ -85,7 +85,7 @@
           <w:sz w:val="24"/>
           <w:szCs w:val="24"/>
         </w:rPr>
-        <w:t xml:space="preserve">July 30, 2026</w:t>
+        <w:t xml:space="preserve">July 31, 2026</w:t>
       </w:r>
     </w:p>
     <w:p>
@@ -3180,6 +3180,11 @@
     </w:p>
     <w:p>
       <w:r>
+        <w:t xml:space="preserve">A series with nothing to display — SR, KO, PR and other non-image objects, or pixel data the built-in decoders cannot render — appears as a white tile with its modality in large bold black text instead of an image. Double-clicking the tile still opens the appropriate viewer for the series.</w:t>
+      </w:r>
+    </w:p>
+    <w:p>
+      <w:r>
         <w:t xml:space="preserve">While the overview is generated, a progress dialog counts the series as they load — studies with thousands of images can take several seconds. Series previews and the folder Preview button show the same dialog while large image sets are scanned and sorted; the application remains responsive throughout.</w:t>
       </w:r>
     </w:p>
@@ -3465,6 +3470,11 @@
       </w:r>
     </w:p>
     <w:p>
+      <w:r>
+        <w:t xml:space="preserve">Files are sent exactly as stored: the association offers each file's own transfer syntax, and when the server accepts it the stored bytes go out verbatim — no re-encoding, byte-perfect, including compressed files when the destination accepts their syntax. If the server negotiates a different syntax instead, the file is converted locally to the negotiated uncompressed syntax (on a temporary copy — the local file is never modified) and sent in that form; a file that cannot be converted is skipped and counted as failed. Every failed file is recorded in the Activity Log with the actual reason.</w:t>
+      </w:r>
+    </w:p>
+    <w:p>
       <w:pPr>
         <w:pStyle w:val="Heading2"/>
       </w:pPr>
@@ -4508,7 +4518,7 @@
           </w:tcPr>
           <w:p>
             <w:r>
-              <w:t xml:space="preserve">Opens the in-app activity log showing the last 500 lines of the DICOM protocol log. Buttons: Refresh (manual update), Copy All (clipboard), Clear. The log auto-refreshes once per second while the dialog is open.</w:t>
+              <w:t xml:space="preserve">Opens the in-app activity log (the last 5000 captured lines). A step-wise level selector scales the view from Errors only, through Errors + warnings and Activity (one line per meaningful operation — the default), up to Everything (full DICOM protocol detail); a filter box narrows the view to lines containing a substring, and a counter shows how many lines each severity holds. Both filters apply to the display only — capture is always complete, so raising the level retroactively reveals the full detail of something that already happened, and dicom.log always records everything. The chosen level persists across sessions. Buttons: Refresh (manual update), Copy Shown (copies the filtered view to the clipboard), Clear. The log auto-refreshes once per second while the dialog is open.</w:t>
             </w:r>
           </w:p>
         </w:tc>
@@ -5291,6 +5301,29 @@
           </w:tcPr>
           <w:p>
             <w:r>
+              <w:t xml:space="preserve">Colour theme</w:t>
+            </w:r>
+          </w:p>
+        </w:tc>
+        <w:tc>
+          <w:tcPr>
+            <w:tcW w:w="6300" w:type="dxa"/>
+          </w:tcPr>
+          <w:p>
+            <w:r>
+              <w:t xml:space="preserve">Selects the colour theme pack: Default (the stock Fyne palette), Adwaita (the GNOME colour specification), or one of the four Catppuccin flavours — Latte (light), Frappé, Macchiato, and Mocha (dark). Default and Adwaita respond to the Light/Dark choice below; the Catppuccin flavours are fixed palettes, so the Theme radio is disabled while one is selected.</w:t>
+            </w:r>
+          </w:p>
+        </w:tc>
+      </w:tr>
+      <w:tr>
+        <w:tc>
+          <w:tcPr>
+            <w:tcW w:w="2700" w:type="dxa"/>
+            <w:shd w:val="clear" w:color="auto" w:fill="F5F5F5"/>
+          </w:tcPr>
+          <w:p>
+            <w:r>
               <w:t xml:space="preserve">Theme</w:t>
             </w:r>
           </w:p>
@@ -5298,19 +5331,19 @@
         <w:tc>
           <w:tcPr>
             <w:tcW w:w="6300" w:type="dxa"/>
-          </w:tcPr>
-          <w:p>
-            <w:r>
-              <w:t xml:space="preserve">Selects the application colour theme: Light or Dark.</w:t>
-            </w:r>
-          </w:p>
-        </w:tc>
-      </w:tr>
-      <w:tr>
-        <w:tc>
-          <w:tcPr>
-            <w:tcW w:w="2700" w:type="dxa"/>
-            <w:shd w:val="clear" w:color="auto" w:fill="F5F5F5"/>
+            <w:shd w:val="clear" w:color="auto" w:fill="F5F5F5"/>
+          </w:tcPr>
+          <w:p>
+            <w:r>
+              <w:t xml:space="preserve">Selects the light or dark variant of the colour theme (Default and Adwaita packs only).</w:t>
+            </w:r>
+          </w:p>
+        </w:tc>
+      </w:tr>
+      <w:tr>
+        <w:tc>
+          <w:tcPr>
+            <w:tcW w:w="2700" w:type="dxa"/>
           </w:tcPr>
           <w:p>
             <w:r>
@@ -5321,7 +5354,6 @@
         <w:tc>
           <w:tcPr>
             <w:tcW w:w="6300" w:type="dxa"/>
-            <w:shd w:val="clear" w:color="auto" w:fill="F5F5F5"/>
           </w:tcPr>
           <w:p>
             <w:r>
@@ -5334,6 +5366,7 @@
         <w:tc>
           <w:tcPr>
             <w:tcW w:w="2700" w:type="dxa"/>
+            <w:shd w:val="clear" w:color="auto" w:fill="F5F5F5"/>
           </w:tcPr>
           <w:p>
             <w:r>
@@ -5344,6 +5377,7 @@
         <w:tc>
           <w:tcPr>
             <w:tcW w:w="6300" w:type="dxa"/>
+            <w:shd w:val="clear" w:color="auto" w:fill="F5F5F5"/>
           </w:tcPr>
           <w:p>
             <w:r>
@@ -5356,7 +5390,6 @@
         <w:tc>
           <w:tcPr>
             <w:tcW w:w="2700" w:type="dxa"/>
-            <w:shd w:val="clear" w:color="auto" w:fill="F5F5F5"/>
           </w:tcPr>
           <w:p>
             <w:r>
@@ -5367,7 +5400,6 @@
         <w:tc>
           <w:tcPr>
             <w:tcW w:w="6300" w:type="dxa"/>
-            <w:shd w:val="clear" w:color="auto" w:fill="F5F5F5"/>
           </w:tcPr>
           <w:p>
             <w:r>
@@ -6172,7 +6204,7 @@
                 <w:szCs w:val="18"/>
                 <w:shd w:val="clear" w:color="auto" w:fill="EBEBEB"/>
               </w:rPr>
-              <w:t xml:space="preserve">v1.10.0</w:t>
+              <w:t xml:space="preserve">v1.11.0</w:t>
             </w:r>
           </w:p>
         </w:tc>
@@ -7631,6 +7663,205 @@
           <w:p>
             <w:r>
               <w:t xml:space="preserve">Abort a retrieve when no progress response and no received file arrives for this many seconds. 0 uses the default (120 s); -1 disables stall detection. Recovers from PACS servers whose C-MOVE agent hangs on non-image objects (SR/PR). Editable in Preferences &gt; SCP &amp; Network.</w:t>
+            </w:r>
+          </w:p>
+        </w:tc>
+      </w:tr>
+      <w:tr>
+        <w:tc>
+          <w:tcPr>
+            <w:tcW w:w="2200" w:type="dxa"/>
+          </w:tcPr>
+          <w:p>
+            <w:r>
+              <w:rPr>
+                <w:rFonts w:ascii="Courier New" w:hAnsi="Courier New"/>
+                <w:sz w:val="18"/>
+                <w:szCs w:val="18"/>
+                <w:shd w:val="clear" w:color="auto" w:fill="EBEBEB"/>
+              </w:rPr>
+              <w:t xml:space="preserve">uiTheme</w:t>
+            </w:r>
+          </w:p>
+        </w:tc>
+        <w:tc>
+          <w:tcPr>
+            <w:tcW w:w="1600" w:type="dxa"/>
+          </w:tcPr>
+          <w:p>
+            <w:r>
+              <w:rPr>
+                <w:rFonts w:ascii="Courier New" w:hAnsi="Courier New"/>
+                <w:sz w:val="18"/>
+                <w:szCs w:val="18"/>
+                <w:shd w:val="clear" w:color="auto" w:fill="EBEBEB"/>
+              </w:rPr>
+              <w:t xml:space="preserve">""</w:t>
+            </w:r>
+          </w:p>
+        </w:tc>
+        <w:tc>
+          <w:tcPr>
+            <w:tcW w:w="5200" w:type="dxa"/>
+          </w:tcPr>
+          <w:p>
+            <w:r>
+              <w:t xml:space="preserve">Colour theme pack: empty (stock theme), </w:t>
+            </w:r>
+            <w:r>
+              <w:rPr>
+                <w:rFonts w:ascii="Courier New" w:hAnsi="Courier New"/>
+                <w:sz w:val="18"/>
+                <w:szCs w:val="18"/>
+                <w:shd w:val="clear" w:color="auto" w:fill="EBEBEB"/>
+              </w:rPr>
+              <w:t xml:space="preserve">adwaita</w:t>
+            </w:r>
+            <w:r>
+              <w:t xml:space="preserve">, </w:t>
+            </w:r>
+            <w:r>
+              <w:rPr>
+                <w:rFonts w:ascii="Courier New" w:hAnsi="Courier New"/>
+                <w:sz w:val="18"/>
+                <w:szCs w:val="18"/>
+                <w:shd w:val="clear" w:color="auto" w:fill="EBEBEB"/>
+              </w:rPr>
+              <w:t xml:space="preserve">catppuccin-latte</w:t>
+            </w:r>
+            <w:r>
+              <w:t xml:space="preserve">, </w:t>
+            </w:r>
+            <w:r>
+              <w:rPr>
+                <w:rFonts w:ascii="Courier New" w:hAnsi="Courier New"/>
+                <w:sz w:val="18"/>
+                <w:szCs w:val="18"/>
+                <w:shd w:val="clear" w:color="auto" w:fill="EBEBEB"/>
+              </w:rPr>
+              <w:t xml:space="preserve">catppuccin-frappe</w:t>
+            </w:r>
+            <w:r>
+              <w:t xml:space="preserve">, </w:t>
+            </w:r>
+            <w:r>
+              <w:rPr>
+                <w:rFonts w:ascii="Courier New" w:hAnsi="Courier New"/>
+                <w:sz w:val="18"/>
+                <w:szCs w:val="18"/>
+                <w:shd w:val="clear" w:color="auto" w:fill="EBEBEB"/>
+              </w:rPr>
+              <w:t xml:space="preserve">catppuccin-macchiato</w:t>
+            </w:r>
+            <w:r>
+              <w:t xml:space="preserve">, or </w:t>
+            </w:r>
+            <w:r>
+              <w:rPr>
+                <w:rFonts w:ascii="Courier New" w:hAnsi="Courier New"/>
+                <w:sz w:val="18"/>
+                <w:szCs w:val="18"/>
+                <w:shd w:val="clear" w:color="auto" w:fill="EBEBEB"/>
+              </w:rPr>
+              <w:t xml:space="preserve">catppuccin-mocha</w:t>
+            </w:r>
+            <w:r>
+              <w:t xml:space="preserve">.</w:t>
+            </w:r>
+          </w:p>
+        </w:tc>
+      </w:tr>
+      <w:tr>
+        <w:tc>
+          <w:tcPr>
+            <w:tcW w:w="2200" w:type="dxa"/>
+            <w:shd w:val="clear" w:color="auto" w:fill="F5F5F5"/>
+          </w:tcPr>
+          <w:p>
+            <w:r>
+              <w:rPr>
+                <w:rFonts w:ascii="Courier New" w:hAnsi="Courier New"/>
+                <w:sz w:val="18"/>
+                <w:szCs w:val="18"/>
+                <w:shd w:val="clear" w:color="auto" w:fill="EBEBEB"/>
+              </w:rPr>
+              <w:t xml:space="preserve">logViewLevel</w:t>
+            </w:r>
+          </w:p>
+        </w:tc>
+        <w:tc>
+          <w:tcPr>
+            <w:tcW w:w="1600" w:type="dxa"/>
+            <w:shd w:val="clear" w:color="auto" w:fill="F5F5F5"/>
+          </w:tcPr>
+          <w:p>
+            <w:r>
+              <w:rPr>
+                <w:rFonts w:ascii="Courier New" w:hAnsi="Courier New"/>
+                <w:sz w:val="18"/>
+                <w:szCs w:val="18"/>
+                <w:shd w:val="clear" w:color="auto" w:fill="EBEBEB"/>
+              </w:rPr>
+              <w:t xml:space="preserve">"activity"</w:t>
+            </w:r>
+          </w:p>
+        </w:tc>
+        <w:tc>
+          <w:tcPr>
+            <w:tcW w:w="5200" w:type="dxa"/>
+            <w:shd w:val="clear" w:color="auto" w:fill="F5F5F5"/>
+          </w:tcPr>
+          <w:p>
+            <w:r>
+              <w:t xml:space="preserve">Activity Log view filter: </w:t>
+            </w:r>
+            <w:r>
+              <w:rPr>
+                <w:rFonts w:ascii="Courier New" w:hAnsi="Courier New"/>
+                <w:sz w:val="18"/>
+                <w:szCs w:val="18"/>
+                <w:shd w:val="clear" w:color="auto" w:fill="EBEBEB"/>
+              </w:rPr>
+              <w:t xml:space="preserve">errors</w:t>
+            </w:r>
+            <w:r>
+              <w:t xml:space="preserve">, </w:t>
+            </w:r>
+            <w:r>
+              <w:rPr>
+                <w:rFonts w:ascii="Courier New" w:hAnsi="Courier New"/>
+                <w:sz w:val="18"/>
+                <w:szCs w:val="18"/>
+                <w:shd w:val="clear" w:color="auto" w:fill="EBEBEB"/>
+              </w:rPr>
+              <w:t xml:space="preserve">warnings</w:t>
+            </w:r>
+            <w:r>
+              <w:t xml:space="preserve">, </w:t>
+            </w:r>
+            <w:r>
+              <w:rPr>
+                <w:rFonts w:ascii="Courier New" w:hAnsi="Courier New"/>
+                <w:sz w:val="18"/>
+                <w:szCs w:val="18"/>
+                <w:shd w:val="clear" w:color="auto" w:fill="EBEBEB"/>
+              </w:rPr>
+              <w:t xml:space="preserve">activity</w:t>
+            </w:r>
+            <w:r>
+              <w:t xml:space="preserve">, or </w:t>
+            </w:r>
+            <w:r>
+              <w:rPr>
+                <w:rFonts w:ascii="Courier New" w:hAnsi="Courier New"/>
+                <w:sz w:val="18"/>
+                <w:szCs w:val="18"/>
+                <w:shd w:val="clear" w:color="auto" w:fill="EBEBEB"/>
+              </w:rPr>
+              <w:t xml:space="preserve">everything</w:t>
+            </w:r>
+            <w:r>
+              <w:t xml:space="preserve">. Display-time only — capture and dicom.log always record everything.</w:t>
             </w:r>
           </w:p>
         </w:tc>

</xml_diff>

<commit_message>
Release v1.12.0 — ultrasound echo studies play as chapters with cine transport and filmstrip; multi-phase MR navigation with same-slice phase toggling; frame-by-frame preview of multi-frame files; automatic NVIDIA Threaded Optimization guard; Activity Log virtualized errors-first view
Co-Authored-By: Claude Opus 5 (1M context) <noreply@anthropic.com>
</commit_message>
<xml_diff>
--- a/dicomqr-user-manual.docx
+++ b/dicomqr-user-manual.docx
@@ -71,7 +71,7 @@
           <w:sz w:val="32"/>
           <w:szCs w:val="32"/>
         </w:rPr>
-        <w:t xml:space="preserve">User Manual  v1.11.0</w:t>
+        <w:t xml:space="preserve">User Manual  v1.12.0</w:t>
       </w:r>
     </w:p>
     <w:p>
@@ -6479,7 +6479,7 @@
                 <w:szCs w:val="18"/>
                 <w:shd w:val="clear" w:color="auto" w:fill="EBEBEB"/>
               </w:rPr>
-              <w:t xml:space="preserve">v1.11.0</w:t>
+              <w:t xml:space="preserve">v1.12.0</w:t>
             </w:r>
           </w:p>
         </w:tc>

</xml_diff>

<commit_message>
Docs: changelog, CLAUDE.md, and the regenerated user manual
CHANGELOG entries for the series-by-series mask review, the owned folder
choosers, and the Import tab's single Browse… button and remembered source
folder. CLAUDE.md documents folderpicker.go and the reworked maskpicker.go
and importtab.go. Manual regenerated from gendoc (go run ./gendoc), which
gains the same coverage.

Co-Authored-By: Claude Fable 5 <noreply@anthropic.com>
</commit_message>
<xml_diff>
--- a/dicomqr-user-manual.docx
+++ b/dicomqr-user-manual.docx
@@ -3978,7 +3978,12 @@
     </w:p>
     <w:p>
       <w:r>
-        <w:t xml:space="preserve">Enter or browse to a source folder and click Scan. dicomqr walks the folder and builds a tree of studies and series found in it. The destination folder (the configured download folder) is shown read-only below the source field.</w:t>
+        <w:t xml:space="preserve">Type a source folder into the field, or click Browse… to choose one, then click Scan. dicomqr walks the folder and builds a tree of studies and series found in it. The destination folder (the configured download folder) is shown read-only below the source field.</w:t>
+      </w:r>
+    </w:p>
+    <w:p>
+      <w:r>
+        <w:t xml:space="preserve">The folder imported from is remembered: it is filled in when the application next starts, and the folder chooser opens there, so importing again from the same disc or department share is a click on Scan. Like every folder chooser in the application, it opens in front of the window that asked for it and starts at the folder currently in the field.</w:t>
       </w:r>
     </w:p>
     <w:p>
@@ -6411,7 +6416,7 @@
     </w:p>
     <w:p>
       <w:r>
-        <w:t xml:space="preserve">Reviewing and masking a run. The Modification dialog's Pixel masking section has a Review masking… button, and for a study with burned-in annotation this is where the work is done. It reads the header of every selected file and groups them — by modality, image size, and for ultrasound whether the file declares a calibrated region, so the analysis screens that need a rectangle are never mixed in with the loops that do not. Choose a group from the list at the top and step through its images one at a time with Previous and Next; each is shown with the areas that will be blanked drawn in black, resolved by the same code the export uses, so what is shown is what will happen.</w:t>
+        <w:t xml:space="preserve">Reviewing and masking a run. The Modification dialog's Pixel masking section has a Review masking… button, and for a study with burned-in annotation this is where the work is done. It reads the header of every selected file and presents them series by series, in acquisition order — for an ultrasound study that is clip by clip, each clip shown at its middle frame. Every control sits beneath the image, in the order the work is done: the slider scrubs the images of the current series, Previous and Next step to another series (named beside them), and the row under those says which image is on screen. The arrow keys step a single image and Ctrl with an arrow key steps a series, for review that needs to be precise rather than quick. Each image is shown with the areas that will be blanked drawn in black, resolved by the same code the export uses, so what is shown is what will happen. Files that cannot be read, or that hold no image, are counted in the window's caption rather than silently left out.</w:t>
       </w:r>
     </w:p>
     <w:p>
@@ -6494,31 +6499,31 @@
           </w:tcPr>
           <w:p>
             <w:r>
-              <w:t xml:space="preserve">The image on screen and no other. The default, and the right choice for an analysis or measurement screen: the next screen in the group is laid out differently, and blanking the same area there would destroy report content the export exists to keep.</w:t>
-            </w:r>
-          </w:p>
-        </w:tc>
-      </w:tr>
-      <w:tr>
-        <w:tc>
-          <w:tcPr>
-            <w:tcW w:w="2700" w:type="dxa"/>
-            <w:shd w:val="clear" w:color="auto" w:fill="F5F5F5"/>
-          </w:tcPr>
-          <w:p>
-            <w:r>
-              <w:t xml:space="preserve">This group</w:t>
-            </w:r>
-          </w:p>
-        </w:tc>
-        <w:tc>
-          <w:tcPr>
-            <w:tcW w:w="6300" w:type="dxa"/>
-            <w:shd w:val="clear" w:color="auto" w:fill="F5F5F5"/>
-          </w:tcPr>
-          <w:p>
-            <w:r>
-              <w:t xml:space="preserve">Every image of the same modality and size — and, for ultrasound, the same answer on whether the file states its own image region. Exactly the group named at the top of the window. Use it where the layout genuinely repeats, such as a series of captures from one machine.</w:t>
+              <w:t xml:space="preserve">The image on screen and no other. The default, and the right choice for an analysis or measurement screen: the next screen is laid out differently, and blanking the same area there would destroy report content the export exists to keep.</w:t>
+            </w:r>
+          </w:p>
+        </w:tc>
+      </w:tr>
+      <w:tr>
+        <w:tc>
+          <w:tcPr>
+            <w:tcW w:w="2700" w:type="dxa"/>
+            <w:shd w:val="clear" w:color="auto" w:fill="F5F5F5"/>
+          </w:tcPr>
+          <w:p>
+            <w:r>
+              <w:t xml:space="preserve">Images of this size</w:t>
+            </w:r>
+          </w:p>
+        </w:tc>
+        <w:tc>
+          <w:tcPr>
+            <w:tcW w:w="6300" w:type="dxa"/>
+            <w:shd w:val="clear" w:color="auto" w:fill="F5F5F5"/>
+          </w:tcPr>
+          <w:p>
+            <w:r>
+              <w:t xml:space="preserve">Every image in the run with this image's modality and pixel dimensions — in this series or any other, since a like-sized image elsewhere carries the same banner in the same place. For ultrasound it also matches on whether the file states its own image region, because calibrated loops and analysis screens are masked by different means. Use it where a layout genuinely repeats, such as a series of captures from one machine.</w:t>
             </w:r>
           </w:p>
         </w:tc>

</xml_diff>

<commit_message>
Release v1.20.1 - credits reworded
The About dialog, CREDITS.md and the manual's credits appendix now name
Jeffrey Leal under Architecture & Design (name, email, GitHub) and Claude
by Anthropic under Implementation (application code and documentation),
replacing the longer descriptions of each role. No functional change:
the version constant, the changelog and the regenerated manual (Markdown
and Word) carry 1.20.1, and CLAUDE.md's description of CREDITS.md follows
the new heading.

Co-Authored-By: Claude Fable 5.1 <noreply@anthropic.com>
</commit_message>
<xml_diff>
--- a/dicomqr-user-manual.docx
+++ b/dicomqr-user-manual.docx
@@ -71,7 +71,7 @@
           <w:sz w:val="32"/>
           <w:szCs w:val="32"/>
         </w:rPr>
-        <w:t xml:space="preserve">User Manual  v1.20.0</w:t>
+        <w:t xml:space="preserve">User Manual  v1.20.1</w:t>
       </w:r>
     </w:p>
     <w:p>
@@ -85,7 +85,7 @@
           <w:sz w:val="24"/>
           <w:szCs w:val="24"/>
         </w:rPr>
-        <w:t xml:space="preserve">September 2, 2026</w:t>
+        <w:t xml:space="preserve">September 3, 2026</w:t>
       </w:r>
     </w:p>
     <w:p>
@@ -6941,7 +6941,7 @@
                 <w:szCs w:val="18"/>
                 <w:shd w:val="clear" w:color="auto" w:fill="EBEBEB"/>
               </w:rPr>
-              <w:t xml:space="preserve">v1.20.0</w:t>
+              <w:t xml:space="preserve">v1.20.1</w:t>
             </w:r>
           </w:p>
         </w:tc>
@@ -9281,22 +9281,17 @@
         <w:pStyle w:val="Heading2"/>
       </w:pPr>
       <w:r>
-        <w:t>Architecture and Direction — Jeffrey Leal</w:t>
-      </w:r>
-    </w:p>
-    <w:p>
-      <w:r>
-        <w:t xml:space="preserve">Email: jeffrey.leal@gmail.com</w:t>
-      </w:r>
-    </w:p>
-    <w:p>
-      <w:r>
-        <w:t xml:space="preserve">GitHub: https://github.com/jeffrey-leal</w:t>
-      </w:r>
-    </w:p>
-    <w:p>
-      <w:r>
-        <w:t xml:space="preserve">Program concept and architecture, feature design and requirements, field testing against clinical PACS systems, and release decisions. The application is built, tested, and published by Jeffrey Leal, who remains responsible for the software.</w:t>
+        <w:t>Architecture &amp; Design</w:t>
+      </w:r>
+    </w:p>
+    <w:p>
+      <w:r>
+        <w:t xml:space="preserve">Jeffrey Leal &lt;jeffrey.leal@gmail.com&gt;</w:t>
+      </w:r>
+    </w:p>
+    <w:p>
+      <w:r>
+        <w:t xml:space="preserve">https://github.com/jeffrey-leal</w:t>
       </w:r>
     </w:p>
     <w:p>
@@ -9304,12 +9299,17 @@
         <w:pStyle w:val="Heading2"/>
       </w:pPr>
       <w:r>
-        <w:t>Implementation — Claude by Anthropic</w:t>
-      </w:r>
-    </w:p>
-    <w:p>
-      <w:r>
-        <w:t xml:space="preserve">All application code, tests, and documentation were written by Claude (https://www.anthropic.com) through Claude Code (https://claude.ai/code), working to Jeffrey Leal's architecture and direction — code generation, DICOM standard research, debugging against field evidence, and this manual.</w:t>
+        <w:t>Implementation</w:t>
+      </w:r>
+    </w:p>
+    <w:p>
+      <w:r>
+        <w:t xml:space="preserve">Claude by Anthropic (https://anthropic.com)</w:t>
+      </w:r>
+    </w:p>
+    <w:p>
+      <w:r>
+        <w:t xml:space="preserve">Application code and documentation</w:t>
       </w:r>
     </w:p>
     <w:p>

</xml_diff>

<commit_message>
PHI check text fields; buttons stand out from the background
PHI check phase 2: the Modification window's PHI check also lists
free-text and identifying fields (phiTextTags: PS3.15 E.1-1 comment
fields and demographics beyond name/ID/birth date) that carry a value
the run neither removes nor sets. textRulesFor mirrors the run's
override layering; "Remove these fields in this run" adds them to the
run's removals only; the completion summary counts exported files that
still carried one.

Buttons: appTheme overrides ColorNameButton (distinctButtonColor) so
ordinary buttons no longer read as bold labels on light themes;
TestButtonsStandOutInEveryTheme holds every pack/variant to contrast
minimums.

Committed ahead of the parallel-transfers work so it can be unwound
on its own. Not field-tested yet; not a release.

Co-Authored-By: Claude Opus 5.5 <noreply@anthropic.com>
</commit_message>
<xml_diff>
--- a/dicomqr-user-manual.docx
+++ b/dicomqr-user-manual.docx
@@ -7291,8 +7291,21 @@
       </w:r>
     </w:p>
     <w:p>
-      <w:r>
-        <w:t xml:space="preserve">An image counts as covered when a mask region blanks part of it or it has been marked as needing no masking in the review window. Each finding offers its remedy: Review the N flagged image(s) in masking… opens the review window on just those images (regions drawn there apply to the whole run, as always); Leave these files out of this run drops the flagged documents from the export; Remove overlay planes ticks that option. The list updates as masking is reviewed and options change. Modify… asks for a confirmation only while a file declares burned-in text or an embedded document is still included — those two are statements the files make about themselves; the other findings are advice. After the run, the completion summary states how many exported files still carried each kind, counted from the files as written, and the Activity Log names each one.</w:t>
+      <w:pPr>
+        <w:pStyle w:val="ListBullet"/>
+      </w:pPr>
+      <w:r>
+        <w:t xml:space="preserve">Free-text and identifying fields that carry a value the profile neither removes nor replaces — the comment fields (Image, Patient, Study, Visit and Identifying Comments, Additional Patient History, Requested Procedure Comments, Imaging Service Request Comments, Comments on the Performed Procedure Step, and report text) and the demographics beyond name, ID and birth date (Other Patient IDs and Names, Patient's Birth Name, Patient's Mother's Birth Name, address, telephone and telecom details, Medical Record Locator, Admission ID). The finding names each field and how many files carry it</w:t>
+      </w:r>
+    </w:p>
+    <w:p>
+      <w:r>
+        <w:t xml:space="preserve">The text fields are the ones the DICOM standard's basic confidentiality profile removes. Patient Name, Patient ID and birth date are not checked, since every profile deals with them, and neither are study, series and protocol descriptions, which carry names too rarely to be worth flagging on every file. A field is found wherever it sits in the file, including inside request sequences, and a per-modality override's removals and keep list are applied just as the run applies them. A field the profile sets to a value of its own counts as dealt with.</w:t>
+      </w:r>
+    </w:p>
+    <w:p>
+      <w:r>
+        <w:t xml:space="preserve">An image counts as covered when a mask region blanks part of it or it has been marked as needing no masking in the review window. Each finding offers its remedy: Review the N flagged image(s) in masking… opens the review window on those images' series (regions drawn there apply to the whole run, as always); Leave these files out of this run drops the flagged documents from the export; Remove overlay planes ticks that option; Remove these fields in this run adds the flagged text fields to this run's removals, where they appear in the Tags removed list — the profile itself is not changed. The list updates as masking is reviewed and options change. Modify… asks for a confirmation only while a file declares burned-in text or an embedded document is still included — those two are statements the files make about themselves; the other findings are advice. After the run, the completion summary states how many exported files still carried each kind, counted from the files as written, and the Activity Log names each one.</w:t>
       </w:r>
     </w:p>
     <w:p>

</xml_diff>

<commit_message>
Release v1.23.0 - parallel transfers, server switch safety, PHI text check
Folds in 222f390 (PHI check text fields; distinct button fill),
4de475e (parallel transfers with per-server limit, Test button,
fallback to one association, typed association rejections, release
before the next association opens) and 237fb82 (changing the server
clears query results and disconnects, confirming first while a
retrieve runs). All field-checked by the user.

CHANGELOG [Unreleased] reconciled and renamed [1.23.0]: dropped an
overstatement ("nothing is lost" on the parallel fallback) and the
stall timeout from the Preferences-during-retrieve fix, which only
ever affected the AE title and the C-GET folder.

Version 1.23.0 in main.go and the manual; manual regenerated. vet,
plain, tagged and race suites pass; release exe imports Windows
system DLLs only.

Co-Authored-By: Claude Opus 5.5 <noreply@anthropic.com>
</commit_message>
<xml_diff>
--- a/dicomqr-user-manual.docx
+++ b/dicomqr-user-manual.docx
@@ -71,7 +71,7 @@
           <w:sz w:val="32"/>
           <w:szCs w:val="32"/>
         </w:rPr>
-        <w:t xml:space="preserve">User Manual  v1.22.0</w:t>
+        <w:t xml:space="preserve">User Manual  v1.23.0</w:t>
       </w:r>
     </w:p>
     <w:p>
@@ -7481,7 +7481,7 @@
                 <w:szCs w:val="18"/>
                 <w:shd w:val="clear" w:color="auto" w:fill="EBEBEB"/>
               </w:rPr>
-              <w:t xml:space="preserve">v1.22.0</w:t>
+              <w:t xml:space="preserve">v1.23.0</w:t>
             </w:r>
           </w:p>
         </w:tc>

</xml_diff>

<commit_message>
Release v1.24.0 - de-identification audit tags, query timeouts, study sizes
Folds in 410f033 (Activity Log holds still while reading; failed
series lookups retry), 9ae1087 (Mark as de-identified profile option;
tags a file lacked inserted in tag order), 73e86ed (study sizes in
query results; queries can no longer hang; worklist Cancel) and
ca8f0d4 (last dialogs become windows; Local Browse Preview/Open in
Viewer buttons removed).

CHANGELOG [Unreleased] reconciled and renamed [1.24.0]: one wording
fix (Open in Viewer opens the item's folder). Version 1.24.0 in
main.go and the manual; manual regenerated. vet, plain, tagged, race
and vendored netdicom suites pass; release exe imports Windows system
DLLs only.

Co-Authored-By: Claude Opus 5.5 <noreply@anthropic.com>
</commit_message>
<xml_diff>
--- a/dicomqr-user-manual.docx
+++ b/dicomqr-user-manual.docx
@@ -71,7 +71,7 @@
           <w:sz w:val="32"/>
           <w:szCs w:val="32"/>
         </w:rPr>
-        <w:t xml:space="preserve">User Manual  v1.23.0</w:t>
+        <w:t xml:space="preserve">User Manual  v1.24.0</w:t>
       </w:r>
     </w:p>
     <w:p>
@@ -7513,7 +7513,7 @@
                 <w:szCs w:val="18"/>
                 <w:shd w:val="clear" w:color="auto" w:fill="EBEBEB"/>
               </w:rPr>
-              <w:t xml:space="preserve">v1.23.0</w:t>
+              <w:t xml:space="preserve">v1.24.0</w:t>
             </w:r>
           </w:p>
         </w:tc>

</xml_diff>

<commit_message>
Filters panel gets its own Connect button
Users often open Filters and fill in a search before connecting, and the panel
is a modal popup, so the server row's Connect could not be reached without
closing it first. The panel's Connect calls the server row's handler and is
enabled and disabled with it; the panel stays open so Search can follow as
soon as the connection is made.

Co-Authored-By: Claude Opus 5.5 <noreply@anthropic.com>
</commit_message>
<xml_diff>
--- a/dicomqr-user-manual.docx
+++ b/dicomqr-user-manual.docx
@@ -1410,7 +1410,12 @@
     </w:p>
     <w:p>
       <w:r>
-        <w:t xml:space="preserve">Click Filters ▾ in the server row to open the search criteria panel. The panel floats over the results tree and contains the search fields along with Search, Clear, and Close buttons. Click Filters ▾ again, or click Close inside the panel, to dismiss it. Values typed in the fields are preserved between open and close cycles.</w:t>
+        <w:t xml:space="preserve">Click Filters ▾ in the server row to open the search criteria panel. The panel floats over the results tree and contains the search fields along with Connect, Search, Clear, and Close buttons. Click Filters ▾ again, or click Close inside the panel, to dismiss it. Values typed in the fields are preserved between open and close cycles.</w:t>
+      </w:r>
+    </w:p>
+    <w:p>
+      <w:r>
+        <w:t xml:space="preserve">Search is available only once you are connected. If you opened the panel before connecting, click Connect inside the panel: it connects to the server selected in the server row, exactly as the Connect button there does, and the panel stays open so you can carry on and search. Like the server row's Connect, it is unavailable while a connection is in progress or already established.</w:t>
       </w:r>
     </w:p>
     <w:p>

</xml_diff>

<commit_message>
Release v1.25.0 - exact-syntax push, receiver context results, Filters Connect
Folds in 23f1908 (push offers each file's exact transfer syntax, so
compressed files are no longer stored mislabelled; any SOP class can be
pushed; receiver reports declined presentation contexts) and 76179be
(Filters panel gets its own Connect button).

CHANGELOG [Unreleased] reconciled and renamed [1.25.0]: three wording
fixes (offer described consistently with the fixed-class-list entry;
"no viewer can display" and "a PACS keeps its existing copy"
overstated). Version 1.25.0 in main.go and the manual, including the
De-identification Method example; manual regenerated. vet, plain,
tagged, race and vendored netdicom suites pass; release exe imports
Windows system DLLs only.

Co-Authored-By: Claude Opus 5.5 <noreply@anthropic.com>
</commit_message>
<xml_diff>
--- a/dicomqr-user-manual.docx
+++ b/dicomqr-user-manual.docx
@@ -71,7 +71,7 @@
           <w:sz w:val="32"/>
           <w:szCs w:val="32"/>
         </w:rPr>
-        <w:t xml:space="preserve">User Manual  v1.24.0</w:t>
+        <w:t xml:space="preserve">User Manual  v1.25.0</w:t>
       </w:r>
     </w:p>
     <w:p>
@@ -6724,7 +6724,7 @@
           </w:tcPr>
           <w:p>
             <w:r>
-              <w:t xml:space="preserve">Record in every exported file that it has been de-identified, as the DICOM standard (PS3.15) expects: Patient Identity Removed (0012,0062) is set to YES, and De-identification Method (0012,0063) names the application, its version and the profile (for example "dicomqr 1.24.0 profile base-deident"). A file already de-identified once before keeps the method recorded then, with this run's added after it. When the run shifts dates by a non-zero number of days, Longitudinal Temporal Information Modified (0028,0303) is also set to MODIFIED, so a downstream system knows the dates are not the originals. If the profile's own Set values write any of these tags, the profile's value is kept. The option only labels the export: it removes nothing by itself, and a profile with nothing else to do is still refused. On in the shipped base-deident profile.</w:t>
+              <w:t xml:space="preserve">Record in every exported file that it has been de-identified, as the DICOM standard (PS3.15) expects: Patient Identity Removed (0012,0062) is set to YES, and De-identification Method (0012,0063) names the application, its version and the profile (for example "dicomqr 1.25.0 profile base-deident"). A file already de-identified once before keeps the method recorded then, with this run's added after it. When the run shifts dates by a non-zero number of days, Longitudinal Temporal Information Modified (0028,0303) is also set to MODIFIED, so a downstream system knows the dates are not the originals. If the profile's own Set values write any of these tags, the profile's value is kept. The option only labels the export: it removes nothing by itself, and a profile with nothing else to do is still refused. On in the shipped base-deident profile.</w:t>
             </w:r>
           </w:p>
         </w:tc>
@@ -7523,7 +7523,7 @@
                 <w:szCs w:val="18"/>
                 <w:shd w:val="clear" w:color="auto" w:fill="EBEBEB"/>
               </w:rPr>
-              <w:t xml:space="preserve">v1.24.0</w:t>
+              <w:t xml:space="preserve">v1.25.0</w:t>
             </w:r>
           </w:p>
         </w:tc>

</xml_diff>